<commit_message>
docs: expand complete 12-page academic HCI report with user personas, HTA, SDT, and full appendices
</commit_message>
<xml_diff>
--- a/AirSlide_HCI_Report.docx
+++ b/AirSlide_HCI_Report.docx
@@ -4,7 +4,7 @@
   <w:body>
     <w:p>
       <w:pPr>
-        <w:spacing w:after="80" w:before="200"/>
+        <w:spacing w:after="70" w:before="200"/>
         <w:jc w:val="center"/>
       </w:pPr>
       <w:r>
@@ -21,7 +21,7 @@
     </w:p>
     <w:p>
       <w:pPr>
-        <w:spacing w:after="150" w:before="40"/>
+        <w:spacing w:after="120" w:before="30"/>
         <w:jc w:val="center"/>
       </w:pPr>
       <w:r>
@@ -32,12 +32,12 @@
           <w:sz w:val="19"/>
           <w:szCs w:val="19"/>
         </w:rPr>
-        <w:t xml:space="preserve">Department of Software Engineering · Human-Computer Interaction Course Project</w:t>
+        <w:t xml:space="preserve">Department of Software Engineering · Human-Computer Interaction (HCI) Course Project</w:t>
       </w:r>
     </w:p>
     <w:p>
       <w:pPr>
-        <w:spacing w:after="120" w:before="100"/>
+        <w:spacing w:after="120" w:before="80"/>
         <w:jc w:val="center"/>
       </w:pPr>
       <w:r>
@@ -74,10 +74,10 @@
             <w:tcW w:type="pct" w:w="55%"/>
             <w:shd w:fill="1E3A8A" w:val="clear"/>
             <w:tcMar>
-              <w:top w:type="dxa" w:w="100"/>
-              <w:left w:type="dxa" w:w="140"/>
-              <w:bottom w:type="dxa" w:w="100"/>
-              <w:right w:type="dxa" w:w="140"/>
+              <w:top w:type="dxa" w:w="90"/>
+              <w:left w:type="dxa" w:w="130"/>
+              <w:bottom w:type="dxa" w:w="90"/>
+              <w:right w:type="dxa" w:w="130"/>
             </w:tcMar>
           </w:tcPr>
           <w:p>
@@ -99,10 +99,10 @@
             <w:tcW w:type="pct" w:w="45%"/>
             <w:shd w:fill="1E3A8A" w:val="clear"/>
             <w:tcMar>
-              <w:top w:type="dxa" w:w="100"/>
-              <w:left w:type="dxa" w:w="140"/>
-              <w:bottom w:type="dxa" w:w="100"/>
-              <w:right w:type="dxa" w:w="140"/>
+              <w:top w:type="dxa" w:w="90"/>
+              <w:left w:type="dxa" w:w="130"/>
+              <w:bottom w:type="dxa" w:w="90"/>
+              <w:right w:type="dxa" w:w="130"/>
             </w:tcMar>
           </w:tcPr>
           <w:p>
@@ -126,10 +126,10 @@
             <w:tcW w:type="pct" w:w="55%"/>
             <w:shd w:fill="F8FAFC" w:val="clear"/>
             <w:tcMar>
-              <w:top w:type="dxa" w:w="100"/>
-              <w:left w:type="dxa" w:w="140"/>
-              <w:bottom w:type="dxa" w:w="100"/>
-              <w:right w:type="dxa" w:w="140"/>
+              <w:top w:type="dxa" w:w="90"/>
+              <w:left w:type="dxa" w:w="130"/>
+              <w:bottom w:type="dxa" w:w="90"/>
+              <w:right w:type="dxa" w:w="130"/>
             </w:tcMar>
           </w:tcPr>
           <w:p>
@@ -171,10 +171,10 @@
             <w:tcW w:type="pct" w:w="45%"/>
             <w:shd w:fill="F8FAFC" w:val="clear"/>
             <w:tcMar>
-              <w:top w:type="dxa" w:w="100"/>
-              <w:left w:type="dxa" w:w="140"/>
-              <w:bottom w:type="dxa" w:w="100"/>
-              <w:right w:type="dxa" w:w="140"/>
+              <w:top w:type="dxa" w:w="90"/>
+              <w:left w:type="dxa" w:w="130"/>
+              <w:bottom w:type="dxa" w:w="90"/>
+              <w:right w:type="dxa" w:w="130"/>
             </w:tcMar>
           </w:tcPr>
           <w:p>
@@ -220,13 +220,13 @@
     </w:tbl>
     <w:p>
       <w:pPr>
-        <w:spacing w:after="80" w:before="200"/>
+        <w:spacing w:after="70" w:before="180"/>
       </w:pPr>
     </w:p>
     <w:p>
       <w:pPr>
         <w:pStyle w:val="Heading1"/>
-        <w:spacing w:after="100" w:before="200"/>
+        <w:spacing w:after="80" w:before="180"/>
       </w:pPr>
       <w:r>
         <w:rPr>
@@ -241,21 +241,21 @@
     </w:p>
     <w:p>
       <w:pPr>
-        <w:spacing w:after="80" w:before="80"/>
+        <w:spacing w:after="70" w:before="70"/>
       </w:pPr>
       <w:r>
         <w:rPr>
           <w:sz w:val="20"/>
           <w:szCs w:val="20"/>
         </w:rPr>
-        <w:t xml:space="preserve">This project report presents the human-centered design, technical engineering, and empirical usability evaluation of AirSlide, a browser-based presentation controller that enables touch-free slide navigation using natural hand gestures detected through a standard laptop webcam. Traditional presentation methods—such as leaning over a laptop to press arrow keys, carrying a dedicated RF clicker with dead batteries, or tapping on a smartphone screen—introduce physical tethering, posture lock, and visual split-attention friction.
-AirSlide runs Google's MediaPipe HandLandmarker neural model entirely inside the user's web browser using WebAssembly (WASM) and WebGL hardware acceleration, providing zero network latency and total data privacy. To solve the classic 'Midas Touch' dilemma (where normal conversational hand gestures trigger unintended slide changes) and eliminate 'Gorilla Arm' shoulder fatigue, AirSlide establishes a robust interaction paradigm: replacing dynamic swipe motions with static finger counting poses, triggering slide changes instantly (0ms latency), and enforcing a 2.0-second post-trigger refractory lockout state machine while the presenter lowers their arm to rest. In formal usability testing with 12 participants across 850 gestures, AirSlide achieved a 100% task completion rate, a 96.4% gesture recognition accuracy, an accidental trigger rate of only 0.08 events per 10 minutes of speaking, and an exceptional System Usability Scale (SUS) score of 84.25 (Grade A).</w:t>
+        <w:t xml:space="preserve">This comprehensive academic project report presents the human-centered design, technical architecture, and empirical usability evaluation of AirSlide, a browser-based presentation controller that enables touch-free slide navigation using natural hand gestures detected via a standard webcam. Traditional presentation control methods—such as standing behind a laptop keyboard, carrying an RF clicker with battery failure risks, or fumbling with mobile companion remotes—introduce physical tethering, posture lock, and visual split-attention friction.
+AirSlide solves these challenges by running Google's MediaPipe HandLandmarker neural model entirely client-side inside the user's web browser using WebAssembly (WASM) and WebGL hardware acceleration, providing zero network latency and total data privacy. To solve the classic 'Midas Touch' problem (where normal conversational hand gestures trigger unintended slide changes) and eliminate 'Gorilla Arm' shoulder fatigue, AirSlide establishes a robust interaction paradigm: replacing dynamic swipe motions with static finger counting poses, triggering slide changes instantly (0ms latency), and enforcing a 2.0-second post-trigger refractory lockout state machine while the presenter lowers their arm to rest. In formal usability testing with 12 participants across 850 gestures, AirSlide achieved a 100% task completion rate, a 96.4% gesture recognition accuracy, an accidental trigger rate of only 0.08 events per 10 minutes of speaking, and an exceptional System Usability Scale (SUS) score of 84.25 (Grade A).</w:t>
       </w:r>
     </w:p>
     <w:p>
       <w:pPr>
         <w:pStyle w:val="Heading1"/>
-        <w:spacing w:after="100" w:before="240"/>
+        <w:spacing w:after="80" w:before="200"/>
       </w:pPr>
       <w:r>
         <w:rPr>
@@ -270,7 +270,7 @@
     </w:p>
     <w:p>
       <w:pPr>
-        <w:spacing w:after="60" w:before="60"/>
+        <w:spacing w:after="50" w:before="50"/>
       </w:pPr>
       <w:r>
         <w:rPr>
@@ -301,7 +301,7 @@
           <w:sz w:val="19"/>
           <w:szCs w:val="19"/>
         </w:rPr>
-        <w:t xml:space="preserve">• Section 4: Task Context, User Analysis &amp; Hierarchical Task Analysis (HTA)
+        <w:t xml:space="preserve">• Section 4: User Analysis, Personas &amp; User Journey Mapping
 </w:t>
       </w:r>
       <w:r>
@@ -309,7 +309,7 @@
           <w:sz w:val="19"/>
           <w:szCs w:val="19"/>
         </w:rPr>
-        <w:t xml:space="preserve">• Section 5: Theoretical HCI Foundations (Fitts' Law, Hick-Hyman Law, Norman's Action Cycle)
+        <w:t xml:space="preserve">• Section 5: Hierarchical Task Analysis (HTA) &amp; Error Recovery Trees
 </w:t>
       </w:r>
       <w:r>
@@ -317,7 +317,7 @@
           <w:sz w:val="19"/>
           <w:szCs w:val="19"/>
         </w:rPr>
-        <w:t xml:space="preserve">• Section 6: Motor Ergonomics, Gorilla Arm Mitigation &amp; Midas Touch Solution
+        <w:t xml:space="preserve">• Section 6: Theoretical HCI Foundations (Fitts' Law, Hick-Hyman Law, Cognitive Load)
 </w:t>
       </w:r>
       <w:r>
@@ -325,7 +325,7 @@
           <w:sz w:val="19"/>
           <w:szCs w:val="19"/>
         </w:rPr>
-        <w:t xml:space="preserve">• Section 7: Dialogue Model, Finite State Machine &amp; Vision Pipeline
+        <w:t xml:space="preserve">• Section 7: Motor Ergonomics, Gorilla Arm Mitigation &amp; Norman's Action Cycle
 </w:t>
       </w:r>
       <w:r>
@@ -333,7 +333,7 @@
           <w:sz w:val="19"/>
           <w:szCs w:val="19"/>
         </w:rPr>
-        <w:t xml:space="preserve">• Section 8: Nielsen's Ten Usability Heuristics Compliance Audit
+        <w:t xml:space="preserve">• Section 8: Dialogue Model, Finite State Machine &amp; Vision Pipeline
 </w:t>
       </w:r>
       <w:r>
@@ -341,7 +341,7 @@
           <w:sz w:val="19"/>
           <w:szCs w:val="19"/>
         </w:rPr>
-        <w:t xml:space="preserve">• Section 9: Empirical Usability Evaluation, Benchmark Results &amp; SUS 10-Item Breakdown
+        <w:t xml:space="preserve">• Section 9: Nielsen's Ten Usability Heuristics &amp; Shneiderman's 8 Golden Rules
 </w:t>
       </w:r>
       <w:r>
@@ -349,7 +349,7 @@
           <w:sz w:val="19"/>
           <w:szCs w:val="19"/>
         </w:rPr>
-        <w:t xml:space="preserve">• Section 10: Discussion, System Limitations &amp; Future Work
+        <w:t xml:space="preserve">• Section 10: Empirical Usability Evaluation, Benchmark Results &amp; SUS 10-Item Breakdown
 </w:t>
       </w:r>
       <w:r>
@@ -357,7 +357,7 @@
           <w:sz w:val="19"/>
           <w:szCs w:val="19"/>
         </w:rPr>
-        <w:t xml:space="preserve">• Section 11: Conclusion
+        <w:t xml:space="preserve">• Section 11: Qualitative Findings, Camera Optical Envelope &amp; Limitations
 </w:t>
       </w:r>
       <w:r>
@@ -365,13 +365,29 @@
           <w:sz w:val="19"/>
           <w:szCs w:val="19"/>
         </w:rPr>
-        <w:t xml:space="preserve">• Section 12: Academic References &amp; Appendix (Team Contributions Matrix)</w:t>
+        <w:t xml:space="preserve">• Section 12: Discussion, Future Directions &amp; Conclusion
+</w:t>
+      </w:r>
+      <w:r>
+        <w:rPr>
+          <w:sz w:val="19"/>
+          <w:szCs w:val="19"/>
+        </w:rPr>
+        <w:t xml:space="preserve">• Section 13: Academic References
+</w:t>
+      </w:r>
+      <w:r>
+        <w:rPr>
+          <w:sz w:val="19"/>
+          <w:szCs w:val="19"/>
+        </w:rPr>
+        <w:t xml:space="preserve">• Appendices A to D (Team Matrix, Usability Script, SUS Formula, System Architecture)</w:t>
       </w:r>
     </w:p>
     <w:p>
       <w:pPr>
         <w:pStyle w:val="Heading1"/>
-        <w:spacing w:after="100" w:before="240"/>
+        <w:spacing w:after="80" w:before="200"/>
       </w:pPr>
       <w:r>
         <w:rPr>
@@ -381,12 +397,12 @@
           <w:sz w:val="24"/>
           <w:szCs w:val="24"/>
         </w:rPr>
-        <w:t xml:space="preserve">3. Introduction &amp; Problem Statement</w:t>
+        <w:t xml:space="preserve">3. Introduction, Problem Domain &amp; Modality Benchmarking</w:t>
       </w:r>
     </w:p>
     <w:p>
       <w:pPr>
-        <w:spacing w:after="80" w:before="80"/>
+        <w:spacing w:after="70" w:before="70"/>
       </w:pPr>
       <w:r>
         <w:rPr>
@@ -404,7 +420,7 @@
           <w:sz w:val="20"/>
           <w:szCs w:val="20"/>
         </w:rPr>
-        <w:t xml:space="preserve">When presenting to an audience, maintaining eye contact, moving naturally, and speaking smoothly are critical. However, existing presentation tools create real physical and mental obstacles:
+        <w:t xml:space="preserve">When delivering a presentation, a speaker needs to focus on communicating with the audience. Existing control tools create clear problems:
 </w:t>
       </w:r>
       <w:r>
@@ -477,7 +493,7 @@
     </w:p>
     <w:p>
       <w:pPr>
-        <w:spacing w:after="80" w:before="120"/>
+        <w:spacing w:after="70" w:before="100"/>
       </w:pPr>
       <w:r>
         <w:rPr>
@@ -513,10 +529,10 @@
             <w:tcW w:type="pct" w:w="22%"/>
             <w:shd w:fill="1E3A8A" w:val="clear"/>
             <w:tcMar>
-              <w:top w:type="dxa" w:w="100"/>
-              <w:left w:type="dxa" w:w="140"/>
-              <w:bottom w:type="dxa" w:w="100"/>
-              <w:right w:type="dxa" w:w="140"/>
+              <w:top w:type="dxa" w:w="90"/>
+              <w:left w:type="dxa" w:w="130"/>
+              <w:bottom w:type="dxa" w:w="90"/>
+              <w:right w:type="dxa" w:w="130"/>
             </w:tcMar>
           </w:tcPr>
           <w:p>
@@ -538,10 +554,10 @@
             <w:tcW w:type="pct" w:w="24%"/>
             <w:shd w:fill="1E3A8A" w:val="clear"/>
             <w:tcMar>
-              <w:top w:type="dxa" w:w="100"/>
-              <w:left w:type="dxa" w:w="140"/>
-              <w:bottom w:type="dxa" w:w="100"/>
-              <w:right w:type="dxa" w:w="140"/>
+              <w:top w:type="dxa" w:w="90"/>
+              <w:left w:type="dxa" w:w="130"/>
+              <w:bottom w:type="dxa" w:w="90"/>
+              <w:right w:type="dxa" w:w="130"/>
             </w:tcMar>
           </w:tcPr>
           <w:p>
@@ -563,10 +579,10 @@
             <w:tcW w:type="pct" w:w="22%"/>
             <w:shd w:fill="1E3A8A" w:val="clear"/>
             <w:tcMar>
-              <w:top w:type="dxa" w:w="100"/>
-              <w:left w:type="dxa" w:w="140"/>
-              <w:bottom w:type="dxa" w:w="100"/>
-              <w:right w:type="dxa" w:w="140"/>
+              <w:top w:type="dxa" w:w="90"/>
+              <w:left w:type="dxa" w:w="130"/>
+              <w:bottom w:type="dxa" w:w="90"/>
+              <w:right w:type="dxa" w:w="130"/>
             </w:tcMar>
           </w:tcPr>
           <w:p>
@@ -588,10 +604,10 @@
             <w:tcW w:type="pct" w:w="32%"/>
             <w:shd w:fill="1E3A8A" w:val="clear"/>
             <w:tcMar>
-              <w:top w:type="dxa" w:w="100"/>
-              <w:left w:type="dxa" w:w="140"/>
-              <w:bottom w:type="dxa" w:w="100"/>
-              <w:right w:type="dxa" w:w="140"/>
+              <w:top w:type="dxa" w:w="90"/>
+              <w:left w:type="dxa" w:w="130"/>
+              <w:bottom w:type="dxa" w:w="90"/>
+              <w:right w:type="dxa" w:w="130"/>
             </w:tcMar>
           </w:tcPr>
           <w:p>
@@ -615,10 +631,10 @@
             <w:tcW w:type="pct" w:w="22%"/>
             <w:shd w:fill="F8FAFC" w:val="clear"/>
             <w:tcMar>
-              <w:top w:type="dxa" w:w="100"/>
-              <w:left w:type="dxa" w:w="140"/>
-              <w:bottom w:type="dxa" w:w="100"/>
-              <w:right w:type="dxa" w:w="140"/>
+              <w:top w:type="dxa" w:w="90"/>
+              <w:left w:type="dxa" w:w="130"/>
+              <w:bottom w:type="dxa" w:w="90"/>
+              <w:right w:type="dxa" w:w="130"/>
             </w:tcMar>
           </w:tcPr>
           <w:p>
@@ -640,10 +656,10 @@
             <w:tcW w:type="pct" w:w="24%"/>
             <w:shd w:fill="F8FAFC" w:val="clear"/>
             <w:tcMar>
-              <w:top w:type="dxa" w:w="100"/>
-              <w:left w:type="dxa" w:w="140"/>
-              <w:bottom w:type="dxa" w:w="100"/>
-              <w:right w:type="dxa" w:w="140"/>
+              <w:top w:type="dxa" w:w="90"/>
+              <w:left w:type="dxa" w:w="130"/>
+              <w:bottom w:type="dxa" w:w="90"/>
+              <w:right w:type="dxa" w:w="130"/>
             </w:tcMar>
           </w:tcPr>
           <w:p>
@@ -665,10 +681,10 @@
             <w:tcW w:type="pct" w:w="22%"/>
             <w:shd w:fill="F8FAFC" w:val="clear"/>
             <w:tcMar>
-              <w:top w:type="dxa" w:w="100"/>
-              <w:left w:type="dxa" w:w="140"/>
-              <w:bottom w:type="dxa" w:w="100"/>
-              <w:right w:type="dxa" w:w="140"/>
+              <w:top w:type="dxa" w:w="90"/>
+              <w:left w:type="dxa" w:w="130"/>
+              <w:bottom w:type="dxa" w:w="90"/>
+              <w:right w:type="dxa" w:w="130"/>
             </w:tcMar>
           </w:tcPr>
           <w:p>
@@ -690,10 +706,10 @@
             <w:tcW w:type="pct" w:w="32%"/>
             <w:shd w:fill="F8FAFC" w:val="clear"/>
             <w:tcMar>
-              <w:top w:type="dxa" w:w="100"/>
-              <w:left w:type="dxa" w:w="140"/>
-              <w:bottom w:type="dxa" w:w="100"/>
-              <w:right w:type="dxa" w:w="140"/>
+              <w:top w:type="dxa" w:w="90"/>
+              <w:left w:type="dxa" w:w="130"/>
+              <w:bottom w:type="dxa" w:w="90"/>
+              <w:right w:type="dxa" w:w="130"/>
             </w:tcMar>
           </w:tcPr>
           <w:p>
@@ -717,10 +733,10 @@
             <w:tcW w:type="pct" w:w="22%"/>
             <w:shd w:fill="F8FAFC" w:val="clear"/>
             <w:tcMar>
-              <w:top w:type="dxa" w:w="100"/>
-              <w:left w:type="dxa" w:w="140"/>
-              <w:bottom w:type="dxa" w:w="100"/>
-              <w:right w:type="dxa" w:w="140"/>
+              <w:top w:type="dxa" w:w="90"/>
+              <w:left w:type="dxa" w:w="130"/>
+              <w:bottom w:type="dxa" w:w="90"/>
+              <w:right w:type="dxa" w:w="130"/>
             </w:tcMar>
           </w:tcPr>
           <w:p>
@@ -742,10 +758,10 @@
             <w:tcW w:type="pct" w:w="24%"/>
             <w:shd w:fill="F8FAFC" w:val="clear"/>
             <w:tcMar>
-              <w:top w:type="dxa" w:w="100"/>
-              <w:left w:type="dxa" w:w="140"/>
-              <w:bottom w:type="dxa" w:w="100"/>
-              <w:right w:type="dxa" w:w="140"/>
+              <w:top w:type="dxa" w:w="90"/>
+              <w:left w:type="dxa" w:w="130"/>
+              <w:bottom w:type="dxa" w:w="90"/>
+              <w:right w:type="dxa" w:w="130"/>
             </w:tcMar>
           </w:tcPr>
           <w:p>
@@ -767,10 +783,10 @@
             <w:tcW w:type="pct" w:w="22%"/>
             <w:shd w:fill="F8FAFC" w:val="clear"/>
             <w:tcMar>
-              <w:top w:type="dxa" w:w="100"/>
-              <w:left w:type="dxa" w:w="140"/>
-              <w:bottom w:type="dxa" w:w="100"/>
-              <w:right w:type="dxa" w:w="140"/>
+              <w:top w:type="dxa" w:w="90"/>
+              <w:left w:type="dxa" w:w="130"/>
+              <w:bottom w:type="dxa" w:w="90"/>
+              <w:right w:type="dxa" w:w="130"/>
             </w:tcMar>
           </w:tcPr>
           <w:p>
@@ -792,10 +808,10 @@
             <w:tcW w:type="pct" w:w="32%"/>
             <w:shd w:fill="F8FAFC" w:val="clear"/>
             <w:tcMar>
-              <w:top w:type="dxa" w:w="100"/>
-              <w:left w:type="dxa" w:w="140"/>
-              <w:bottom w:type="dxa" w:w="100"/>
-              <w:right w:type="dxa" w:w="140"/>
+              <w:top w:type="dxa" w:w="90"/>
+              <w:left w:type="dxa" w:w="130"/>
+              <w:bottom w:type="dxa" w:w="90"/>
+              <w:right w:type="dxa" w:w="130"/>
             </w:tcMar>
           </w:tcPr>
           <w:p>
@@ -819,10 +835,10 @@
             <w:tcW w:type="pct" w:w="22%"/>
             <w:shd w:fill="F8FAFC" w:val="clear"/>
             <w:tcMar>
-              <w:top w:type="dxa" w:w="100"/>
-              <w:left w:type="dxa" w:w="140"/>
-              <w:bottom w:type="dxa" w:w="100"/>
-              <w:right w:type="dxa" w:w="140"/>
+              <w:top w:type="dxa" w:w="90"/>
+              <w:left w:type="dxa" w:w="130"/>
+              <w:bottom w:type="dxa" w:w="90"/>
+              <w:right w:type="dxa" w:w="130"/>
             </w:tcMar>
           </w:tcPr>
           <w:p>
@@ -844,10 +860,10 @@
             <w:tcW w:type="pct" w:w="24%"/>
             <w:shd w:fill="F8FAFC" w:val="clear"/>
             <w:tcMar>
-              <w:top w:type="dxa" w:w="100"/>
-              <w:left w:type="dxa" w:w="140"/>
-              <w:bottom w:type="dxa" w:w="100"/>
-              <w:right w:type="dxa" w:w="140"/>
+              <w:top w:type="dxa" w:w="90"/>
+              <w:left w:type="dxa" w:w="130"/>
+              <w:bottom w:type="dxa" w:w="90"/>
+              <w:right w:type="dxa" w:w="130"/>
             </w:tcMar>
           </w:tcPr>
           <w:p>
@@ -869,10 +885,10 @@
             <w:tcW w:type="pct" w:w="22%"/>
             <w:shd w:fill="F8FAFC" w:val="clear"/>
             <w:tcMar>
-              <w:top w:type="dxa" w:w="100"/>
-              <w:left w:type="dxa" w:w="140"/>
-              <w:bottom w:type="dxa" w:w="100"/>
-              <w:right w:type="dxa" w:w="140"/>
+              <w:top w:type="dxa" w:w="90"/>
+              <w:left w:type="dxa" w:w="130"/>
+              <w:bottom w:type="dxa" w:w="90"/>
+              <w:right w:type="dxa" w:w="130"/>
             </w:tcMar>
           </w:tcPr>
           <w:p>
@@ -894,10 +910,10 @@
             <w:tcW w:type="pct" w:w="32%"/>
             <w:shd w:fill="F8FAFC" w:val="clear"/>
             <w:tcMar>
-              <w:top w:type="dxa" w:w="100"/>
-              <w:left w:type="dxa" w:w="140"/>
-              <w:bottom w:type="dxa" w:w="100"/>
-              <w:right w:type="dxa" w:w="140"/>
+              <w:top w:type="dxa" w:w="90"/>
+              <w:left w:type="dxa" w:w="130"/>
+              <w:bottom w:type="dxa" w:w="90"/>
+              <w:right w:type="dxa" w:w="130"/>
             </w:tcMar>
           </w:tcPr>
           <w:p>
@@ -921,10 +937,10 @@
             <w:tcW w:type="pct" w:w="22%"/>
             <w:shd w:fill="F8FAFC" w:val="clear"/>
             <w:tcMar>
-              <w:top w:type="dxa" w:w="100"/>
-              <w:left w:type="dxa" w:w="140"/>
-              <w:bottom w:type="dxa" w:w="100"/>
-              <w:right w:type="dxa" w:w="140"/>
+              <w:top w:type="dxa" w:w="90"/>
+              <w:left w:type="dxa" w:w="130"/>
+              <w:bottom w:type="dxa" w:w="90"/>
+              <w:right w:type="dxa" w:w="130"/>
             </w:tcMar>
           </w:tcPr>
           <w:p>
@@ -946,10 +962,10 @@
             <w:tcW w:type="pct" w:w="24%"/>
             <w:shd w:fill="F8FAFC" w:val="clear"/>
             <w:tcMar>
-              <w:top w:type="dxa" w:w="100"/>
-              <w:left w:type="dxa" w:w="140"/>
-              <w:bottom w:type="dxa" w:w="100"/>
-              <w:right w:type="dxa" w:w="140"/>
+              <w:top w:type="dxa" w:w="90"/>
+              <w:left w:type="dxa" w:w="130"/>
+              <w:bottom w:type="dxa" w:w="90"/>
+              <w:right w:type="dxa" w:w="130"/>
             </w:tcMar>
           </w:tcPr>
           <w:p>
@@ -971,10 +987,10 @@
             <w:tcW w:type="pct" w:w="22%"/>
             <w:shd w:fill="F8FAFC" w:val="clear"/>
             <w:tcMar>
-              <w:top w:type="dxa" w:w="100"/>
-              <w:left w:type="dxa" w:w="140"/>
-              <w:bottom w:type="dxa" w:w="100"/>
-              <w:right w:type="dxa" w:w="140"/>
+              <w:top w:type="dxa" w:w="90"/>
+              <w:left w:type="dxa" w:w="130"/>
+              <w:bottom w:type="dxa" w:w="90"/>
+              <w:right w:type="dxa" w:w="130"/>
             </w:tcMar>
           </w:tcPr>
           <w:p>
@@ -996,10 +1012,10 @@
             <w:tcW w:type="pct" w:w="32%"/>
             <w:shd w:fill="F8FAFC" w:val="clear"/>
             <w:tcMar>
-              <w:top w:type="dxa" w:w="100"/>
-              <w:left w:type="dxa" w:w="140"/>
-              <w:bottom w:type="dxa" w:w="100"/>
-              <w:right w:type="dxa" w:w="140"/>
+              <w:top w:type="dxa" w:w="90"/>
+              <w:left w:type="dxa" w:w="130"/>
+              <w:bottom w:type="dxa" w:w="90"/>
+              <w:right w:type="dxa" w:w="130"/>
             </w:tcMar>
           </w:tcPr>
           <w:p>
@@ -1023,10 +1039,10 @@
             <w:tcW w:type="pct" w:w="22%"/>
             <w:shd w:fill="F8FAFC" w:val="clear"/>
             <w:tcMar>
-              <w:top w:type="dxa" w:w="100"/>
-              <w:left w:type="dxa" w:w="140"/>
-              <w:bottom w:type="dxa" w:w="100"/>
-              <w:right w:type="dxa" w:w="140"/>
+              <w:top w:type="dxa" w:w="90"/>
+              <w:left w:type="dxa" w:w="130"/>
+              <w:bottom w:type="dxa" w:w="90"/>
+              <w:right w:type="dxa" w:w="130"/>
             </w:tcMar>
           </w:tcPr>
           <w:p>
@@ -1048,10 +1064,10 @@
             <w:tcW w:type="pct" w:w="24%"/>
             <w:shd w:fill="F8FAFC" w:val="clear"/>
             <w:tcMar>
-              <w:top w:type="dxa" w:w="100"/>
-              <w:left w:type="dxa" w:w="140"/>
-              <w:bottom w:type="dxa" w:w="100"/>
-              <w:right w:type="dxa" w:w="140"/>
+              <w:top w:type="dxa" w:w="90"/>
+              <w:left w:type="dxa" w:w="130"/>
+              <w:bottom w:type="dxa" w:w="90"/>
+              <w:right w:type="dxa" w:w="130"/>
             </w:tcMar>
           </w:tcPr>
           <w:p>
@@ -1073,10 +1089,10 @@
             <w:tcW w:type="pct" w:w="22%"/>
             <w:shd w:fill="F8FAFC" w:val="clear"/>
             <w:tcMar>
-              <w:top w:type="dxa" w:w="100"/>
-              <w:left w:type="dxa" w:w="140"/>
-              <w:bottom w:type="dxa" w:w="100"/>
-              <w:right w:type="dxa" w:w="140"/>
+              <w:top w:type="dxa" w:w="90"/>
+              <w:left w:type="dxa" w:w="130"/>
+              <w:bottom w:type="dxa" w:w="90"/>
+              <w:right w:type="dxa" w:w="130"/>
             </w:tcMar>
           </w:tcPr>
           <w:p>
@@ -1098,10 +1114,10 @@
             <w:tcW w:type="pct" w:w="32%"/>
             <w:shd w:fill="F8FAFC" w:val="clear"/>
             <w:tcMar>
-              <w:top w:type="dxa" w:w="100"/>
-              <w:left w:type="dxa" w:w="140"/>
-              <w:bottom w:type="dxa" w:w="100"/>
-              <w:right w:type="dxa" w:w="140"/>
+              <w:top w:type="dxa" w:w="90"/>
+              <w:left w:type="dxa" w:w="130"/>
+              <w:bottom w:type="dxa" w:w="90"/>
+              <w:right w:type="dxa" w:w="130"/>
             </w:tcMar>
           </w:tcPr>
           <w:p>
@@ -1123,7 +1139,7 @@
     <w:p>
       <w:pPr>
         <w:pStyle w:val="Heading1"/>
-        <w:spacing w:after="100" w:before="240"/>
+        <w:spacing w:after="80" w:before="200"/>
       </w:pPr>
       <w:r>
         <w:rPr>
@@ -1133,12 +1149,12 @@
           <w:sz w:val="24"/>
           <w:szCs w:val="24"/>
         </w:rPr>
-        <w:t xml:space="preserve">4. Task Context, User Analysis &amp; Hierarchical Task Analysis</w:t>
+        <w:t xml:space="preserve">4. User Analysis, Personas &amp; User Journey Mapping</w:t>
       </w:r>
     </w:p>
     <w:p>
       <w:pPr>
-        <w:spacing w:after="80" w:before="80"/>
+        <w:spacing w:after="70" w:before="70"/>
       </w:pPr>
       <w:r>
         <w:rPr>
@@ -1148,7 +1164,7 @@
           <w:sz w:val="21"/>
           <w:szCs w:val="21"/>
         </w:rPr>
-        <w:t xml:space="preserve">4.1 Stakeholder Profiles
+        <w:t xml:space="preserve">4.1 User Personas
 </w:t>
       </w:r>
       <w:r>
@@ -1158,14 +1174,14 @@
           <w:sz w:val="20"/>
           <w:szCs w:val="20"/>
         </w:rPr>
-        <w:t xml:space="preserve">• Primary Presenter: </w:t>
+        <w:t xml:space="preserve">• Persona 1: Prof. Samuel (University Lecturer, 52): </w:t>
       </w:r>
       <w:r>
         <w:rPr>
           <w:sz w:val="20"/>
           <w:szCs w:val="20"/>
         </w:rPr>
-        <w:t xml:space="preserve">Needs effortless slide turning with 100% trigger reliability and zero accidental clicks while speaking.
+        <w:t xml:space="preserve">Teaches 200+ students in large lecture halls. Constantly paces the stage. Hates being stuck behind the podium laptop. Needs a reliable way to turn slides without holding a remote while writing on whiteboards.
 </w:t>
       </w:r>
       <w:r>
@@ -1175,14 +1191,14 @@
           <w:sz w:val="20"/>
           <w:szCs w:val="20"/>
         </w:rPr>
-        <w:t xml:space="preserve">• Audience: </w:t>
+        <w:t xml:space="preserve">• Persona 2: Sarah Lin (Lead Software Architect, 34): </w:t>
       </w:r>
       <w:r>
         <w:rPr>
           <w:sz w:val="20"/>
           <w:szCs w:val="20"/>
         </w:rPr>
-        <w:t xml:space="preserve">Needs uninterrupted presentation flow without distracting technical pauses, misclicks, or speaker fumbling.
+        <w:t xml:space="preserve">Presents technical system designs at developer summits. Delivers fast-paced slide walkthroughs and live architecture diagrams. Needs instant slide switching (0ms lag) and a continuous laser pointer to highlight code blocks.
 </w:t>
       </w:r>
       <w:r>
@@ -1192,14 +1208,14 @@
           <w:sz w:val="20"/>
           <w:szCs w:val="20"/>
         </w:rPr>
-        <w:t xml:space="preserve">• Event Host / Organizer: </w:t>
+        <w:t xml:space="preserve">• Persona 3: Marcus Vance (Corporate Product Director, 41): </w:t>
       </w:r>
       <w:r>
         <w:rPr>
           <w:sz w:val="20"/>
           <w:szCs w:val="20"/>
         </w:rPr>
-        <w:t xml:space="preserve">Needs zero software installation delays on guest speaker laptops.
+        <w:t xml:space="preserve">Pitches high-stakes product proposals to executive boards. Talks expressively with his hands. Suffered from embarrassing accidental slide changes with older gesture tools. Requires 100% false-positive immunity.
 </w:t>
       </w:r>
       <w:r>
@@ -1210,106 +1226,417 @@
           <w:sz w:val="21"/>
           <w:szCs w:val="21"/>
         </w:rPr>
-        <w:t xml:space="preserve">4.2 Hierarchical Task Analysis (HTA)
+        <w:t xml:space="preserve">4.2 User Journey Mapping
 </w:t>
       </w:r>
-      <w:r>
-        <w:rPr>
-          <w:sz w:val="20"/>
-          <w:szCs w:val="20"/>
-        </w:rPr>
-        <w:t xml:space="preserve">The presentation delivery workflow is formally decomposed into hierarchical tasks and operational plans:
-</w:t>
-      </w:r>
-      <w:r>
-        <w:rPr>
-          <w:b/>
-          <w:bCs/>
-          <w:sz w:val="20"/>
-          <w:szCs w:val="20"/>
-        </w:rPr>
-        <w:t xml:space="preserve">• Task 0: Deliver Presentation: </w:t>
-      </w:r>
-      <w:r>
-        <w:rPr>
-          <w:sz w:val="20"/>
-          <w:szCs w:val="20"/>
-        </w:rPr>
-        <w:t xml:space="preserve">Plan 0: Execute 1 (Setup), then repeatedly execute 2 (Slide Navigation) and optionally 3 (Laser Pointer) until conclusion. If an error occurs, execute 4 (Recovery).
-</w:t>
-      </w:r>
-      <w:r>
-        <w:rPr>
-          <w:b/>
-          <w:bCs/>
-          <w:sz w:val="20"/>
-          <w:szCs w:val="20"/>
-        </w:rPr>
-        <w:t xml:space="preserve">• Task 1: System Setup: </w:t>
-      </w:r>
-      <w:r>
-        <w:rPr>
-          <w:sz w:val="20"/>
-          <w:szCs w:val="20"/>
-        </w:rPr>
-        <w:t xml:space="preserve">Plan 1: Open browser -&gt; Grant webcam permission -&gt; Verify 21-point hand skeleton in HUD preview.
-</w:t>
-      </w:r>
-      <w:r>
-        <w:rPr>
-          <w:b/>
-          <w:bCs/>
-          <w:sz w:val="20"/>
-          <w:szCs w:val="20"/>
-        </w:rPr>
-        <w:t xml:space="preserve">• Task 2: Active Navigation: </w:t>
-      </w:r>
-      <w:r>
-        <w:rPr>
-          <w:sz w:val="20"/>
-          <w:szCs w:val="20"/>
-        </w:rPr>
-        <w:t xml:space="preserve">Plan 2.1: Flash Peace Sign (2 fingers) to advance. Plan 2.2: Flash Point Up (1 finger) to go back. Plan 2.3: Lower hand immediately during 2.0s cooldown.
-</w:t>
-      </w:r>
-      <w:r>
-        <w:rPr>
-          <w:b/>
-          <w:bCs/>
-          <w:sz w:val="20"/>
-          <w:szCs w:val="20"/>
-        </w:rPr>
-        <w:t xml:space="preserve">• Task 3: Interactive Emphasis: </w:t>
-      </w:r>
-      <w:r>
-        <w:rPr>
-          <w:sz w:val="20"/>
-          <w:szCs w:val="20"/>
-        </w:rPr>
-        <w:t xml:space="preserve">Plan 3.1: Hold Open Palm (5 fingers) to activate real-time laser spotlight. Plan 3.2: Drop hand to deactivate laser.
-</w:t>
-      </w:r>
-      <w:r>
-        <w:rPr>
-          <w:b/>
-          <w:bCs/>
-          <w:sz w:val="20"/>
-          <w:szCs w:val="20"/>
-        </w:rPr>
-        <w:t xml:space="preserve">• Task 4: Emergency Recovery: </w:t>
-      </w:r>
-      <w:r>
-        <w:rPr>
-          <w:sz w:val="20"/>
-          <w:szCs w:val="20"/>
-        </w:rPr>
-        <w:t xml:space="preserve">Plan 4: Press keyboard arrow keys or Spacebar for instant override at any moment.</w:t>
-      </w:r>
     </w:p>
+    <w:tbl>
+      <w:tblPr>
+        <w:tblW w:type="pct" w:w="100%"/>
+        <w:tblBorders>
+          <w:top w:val="single" w:color="CBD5E1" w:sz="4"/>
+          <w:left w:val="single" w:color="CBD5E1" w:sz="4"/>
+          <w:bottom w:val="single" w:color="CBD5E1" w:sz="4"/>
+          <w:right w:val="single" w:color="CBD5E1" w:sz="4"/>
+          <w:insideH w:val="single" w:color="CBD5E1" w:sz="2"/>
+          <w:insideV w:val="single" w:color="CBD5E1" w:sz="2"/>
+        </w:tblBorders>
+      </w:tblPr>
+      <w:tblGrid>
+        <w:gridCol w:w="100"/>
+        <w:gridCol w:w="100"/>
+        <w:gridCol w:w="100"/>
+      </w:tblGrid>
+      <w:tr>
+        <w:tc>
+          <w:tcPr>
+            <w:tcW w:type="pct" w:w="25%"/>
+            <w:shd w:fill="1E3A8A" w:val="clear"/>
+            <w:tcMar>
+              <w:top w:type="dxa" w:w="90"/>
+              <w:left w:type="dxa" w:w="130"/>
+              <w:bottom w:type="dxa" w:w="90"/>
+              <w:right w:type="dxa" w:w="130"/>
+            </w:tcMar>
+          </w:tcPr>
+          <w:p>
+            <w:r>
+              <w:rPr>
+                <w:rFonts w:ascii="Arial" w:cs="Arial" w:eastAsia="Arial" w:hAnsi="Arial"/>
+                <w:b/>
+                <w:bCs/>
+                <w:color w:val="FFFFFF"/>
+                <w:sz w:val="19"/>
+                <w:szCs w:val="19"/>
+              </w:rPr>
+              <w:t xml:space="preserve">Journey Phase</w:t>
+            </w:r>
+          </w:p>
+        </w:tc>
+        <w:tc>
+          <w:tcPr>
+            <w:tcW w:type="pct" w:w="38%"/>
+            <w:shd w:fill="1E3A8A" w:val="clear"/>
+            <w:tcMar>
+              <w:top w:type="dxa" w:w="90"/>
+              <w:left w:type="dxa" w:w="130"/>
+              <w:bottom w:type="dxa" w:w="90"/>
+              <w:right w:type="dxa" w:w="130"/>
+            </w:tcMar>
+          </w:tcPr>
+          <w:p>
+            <w:r>
+              <w:rPr>
+                <w:rFonts w:ascii="Arial" w:cs="Arial" w:eastAsia="Arial" w:hAnsi="Arial"/>
+                <w:b/>
+                <w:bCs/>
+                <w:color w:val="FFFFFF"/>
+                <w:sz w:val="19"/>
+                <w:szCs w:val="19"/>
+              </w:rPr>
+              <w:t xml:space="preserve">Traditional Hardware Remote Experience</w:t>
+            </w:r>
+          </w:p>
+        </w:tc>
+        <w:tc>
+          <w:tcPr>
+            <w:tcW w:type="pct" w:w="37%"/>
+            <w:shd w:fill="1E3A8A" w:val="clear"/>
+            <w:tcMar>
+              <w:top w:type="dxa" w:w="90"/>
+              <w:left w:type="dxa" w:w="130"/>
+              <w:bottom w:type="dxa" w:w="90"/>
+              <w:right w:type="dxa" w:w="130"/>
+            </w:tcMar>
+          </w:tcPr>
+          <w:p>
+            <w:r>
+              <w:rPr>
+                <w:rFonts w:ascii="Arial" w:cs="Arial" w:eastAsia="Arial" w:hAnsi="Arial"/>
+                <w:b/>
+                <w:bCs/>
+                <w:color w:val="FFFFFF"/>
+                <w:sz w:val="19"/>
+                <w:szCs w:val="19"/>
+              </w:rPr>
+              <w:t xml:space="preserve">AirSlide Touch-Free Experience</w:t>
+            </w:r>
+          </w:p>
+        </w:tc>
+      </w:tr>
+      <w:tr>
+        <w:tc>
+          <w:tcPr>
+            <w:tcW w:type="pct" w:w="25%"/>
+            <w:shd w:fill="F8FAFC" w:val="clear"/>
+            <w:tcMar>
+              <w:top w:type="dxa" w:w="90"/>
+              <w:left w:type="dxa" w:w="130"/>
+              <w:bottom w:type="dxa" w:w="90"/>
+              <w:right w:type="dxa" w:w="130"/>
+            </w:tcMar>
+          </w:tcPr>
+          <w:p>
+            <w:r>
+              <w:rPr>
+                <w:rFonts w:ascii="Arial" w:cs="Arial" w:eastAsia="Arial" w:hAnsi="Arial"/>
+                <w:b/>
+                <w:bCs/>
+                <w:color w:val="1E293B"/>
+                <w:sz w:val="19"/>
+                <w:szCs w:val="19"/>
+              </w:rPr>
+              <w:t xml:space="preserve">1. Setup</w:t>
+            </w:r>
+          </w:p>
+        </w:tc>
+        <w:tc>
+          <w:tcPr>
+            <w:tcW w:type="pct" w:w="38%"/>
+            <w:shd w:fill="F8FAFC" w:val="clear"/>
+            <w:tcMar>
+              <w:top w:type="dxa" w:w="90"/>
+              <w:left w:type="dxa" w:w="130"/>
+              <w:bottom w:type="dxa" w:w="90"/>
+              <w:right w:type="dxa" w:w="130"/>
+            </w:tcMar>
+          </w:tcPr>
+          <w:p>
+            <w:r>
+              <w:rPr>
+                <w:rFonts w:ascii="Arial" w:cs="Arial" w:eastAsia="Arial" w:hAnsi="Arial"/>
+                <w:b w:val="false"/>
+                <w:bCs w:val="false"/>
+                <w:color w:val="1E293B"/>
+                <w:sz w:val="19"/>
+                <w:szCs w:val="19"/>
+              </w:rPr>
+              <w:t xml:space="preserve">Search for USB dongle; check batteries; test pairing.</w:t>
+            </w:r>
+          </w:p>
+        </w:tc>
+        <w:tc>
+          <w:tcPr>
+            <w:tcW w:type="pct" w:w="37%"/>
+            <w:shd w:fill="F8FAFC" w:val="clear"/>
+            <w:tcMar>
+              <w:top w:type="dxa" w:w="90"/>
+              <w:left w:type="dxa" w:w="130"/>
+              <w:bottom w:type="dxa" w:w="90"/>
+              <w:right w:type="dxa" w:w="130"/>
+            </w:tcMar>
+          </w:tcPr>
+          <w:p>
+            <w:r>
+              <w:rPr>
+                <w:rFonts w:ascii="Arial" w:cs="Arial" w:eastAsia="Arial" w:hAnsi="Arial"/>
+                <w:b w:val="false"/>
+                <w:bCs w:val="false"/>
+                <w:color w:val="1E293B"/>
+                <w:sz w:val="19"/>
+                <w:szCs w:val="19"/>
+              </w:rPr>
+              <w:t xml:space="preserve">Open web URL; grant camera permission; ready in 5s.</w:t>
+            </w:r>
+          </w:p>
+        </w:tc>
+      </w:tr>
+      <w:tr>
+        <w:tc>
+          <w:tcPr>
+            <w:tcW w:type="pct" w:w="25%"/>
+            <w:shd w:fill="F8FAFC" w:val="clear"/>
+            <w:tcMar>
+              <w:top w:type="dxa" w:w="90"/>
+              <w:left w:type="dxa" w:w="130"/>
+              <w:bottom w:type="dxa" w:w="90"/>
+              <w:right w:type="dxa" w:w="130"/>
+            </w:tcMar>
+          </w:tcPr>
+          <w:p>
+            <w:r>
+              <w:rPr>
+                <w:rFonts w:ascii="Arial" w:cs="Arial" w:eastAsia="Arial" w:hAnsi="Arial"/>
+                <w:b/>
+                <w:bCs/>
+                <w:color w:val="1E293B"/>
+                <w:sz w:val="19"/>
+                <w:szCs w:val="19"/>
+              </w:rPr>
+              <w:t xml:space="preserve">2. Presentation</w:t>
+            </w:r>
+          </w:p>
+        </w:tc>
+        <w:tc>
+          <w:tcPr>
+            <w:tcW w:type="pct" w:w="38%"/>
+            <w:shd w:fill="F8FAFC" w:val="clear"/>
+            <w:tcMar>
+              <w:top w:type="dxa" w:w="90"/>
+              <w:left w:type="dxa" w:w="130"/>
+              <w:bottom w:type="dxa" w:w="90"/>
+              <w:right w:type="dxa" w:w="130"/>
+            </w:tcMar>
+          </w:tcPr>
+          <w:p>
+            <w:r>
+              <w:rPr>
+                <w:rFonts w:ascii="Arial" w:cs="Arial" w:eastAsia="Arial" w:hAnsi="Arial"/>
+                <w:b w:val="false"/>
+                <w:bCs w:val="false"/>
+                <w:color w:val="1E293B"/>
+                <w:sz w:val="19"/>
+                <w:szCs w:val="19"/>
+              </w:rPr>
+              <w:t xml:space="preserve">Hold remote in hand; fumble for forward button.</w:t>
+            </w:r>
+          </w:p>
+        </w:tc>
+        <w:tc>
+          <w:tcPr>
+            <w:tcW w:type="pct" w:w="37%"/>
+            <w:shd w:fill="F8FAFC" w:val="clear"/>
+            <w:tcMar>
+              <w:top w:type="dxa" w:w="90"/>
+              <w:left w:type="dxa" w:w="130"/>
+              <w:bottom w:type="dxa" w:w="90"/>
+              <w:right w:type="dxa" w:w="130"/>
+            </w:tcMar>
+          </w:tcPr>
+          <w:p>
+            <w:r>
+              <w:rPr>
+                <w:rFonts w:ascii="Arial" w:cs="Arial" w:eastAsia="Arial" w:hAnsi="Arial"/>
+                <w:b w:val="false"/>
+                <w:bCs w:val="false"/>
+                <w:color w:val="1E293B"/>
+                <w:sz w:val="19"/>
+                <w:szCs w:val="19"/>
+              </w:rPr>
+              <w:t xml:space="preserve">Flash Peace Sign briefly; keep hands completely free.</w:t>
+            </w:r>
+          </w:p>
+        </w:tc>
+      </w:tr>
+      <w:tr>
+        <w:tc>
+          <w:tcPr>
+            <w:tcW w:type="pct" w:w="25%"/>
+            <w:shd w:fill="F8FAFC" w:val="clear"/>
+            <w:tcMar>
+              <w:top w:type="dxa" w:w="90"/>
+              <w:left w:type="dxa" w:w="130"/>
+              <w:bottom w:type="dxa" w:w="90"/>
+              <w:right w:type="dxa" w:w="130"/>
+            </w:tcMar>
+          </w:tcPr>
+          <w:p>
+            <w:r>
+              <w:rPr>
+                <w:rFonts w:ascii="Arial" w:cs="Arial" w:eastAsia="Arial" w:hAnsi="Arial"/>
+                <w:b/>
+                <w:bCs/>
+                <w:color w:val="1E293B"/>
+                <w:sz w:val="19"/>
+                <w:szCs w:val="19"/>
+              </w:rPr>
+              <w:t xml:space="preserve">3. Emphasis</w:t>
+            </w:r>
+          </w:p>
+        </w:tc>
+        <w:tc>
+          <w:tcPr>
+            <w:tcW w:type="pct" w:w="38%"/>
+            <w:shd w:fill="F8FAFC" w:val="clear"/>
+            <w:tcMar>
+              <w:top w:type="dxa" w:w="90"/>
+              <w:left w:type="dxa" w:w="130"/>
+              <w:bottom w:type="dxa" w:w="90"/>
+              <w:right w:type="dxa" w:w="130"/>
+            </w:tcMar>
+          </w:tcPr>
+          <w:p>
+            <w:r>
+              <w:rPr>
+                <w:rFonts w:ascii="Arial" w:cs="Arial" w:eastAsia="Arial" w:hAnsi="Arial"/>
+                <w:b w:val="false"/>
+                <w:bCs w:val="false"/>
+                <w:color w:val="1E293B"/>
+                <w:sz w:val="19"/>
+                <w:szCs w:val="19"/>
+              </w:rPr>
+              <w:t xml:space="preserve">Struggle with dim hardware laser dot on screens.</w:t>
+            </w:r>
+          </w:p>
+        </w:tc>
+        <w:tc>
+          <w:tcPr>
+            <w:tcW w:type="pct" w:w="37%"/>
+            <w:shd w:fill="F8FAFC" w:val="clear"/>
+            <w:tcMar>
+              <w:top w:type="dxa" w:w="90"/>
+              <w:left w:type="dxa" w:w="130"/>
+              <w:bottom w:type="dxa" w:w="90"/>
+              <w:right w:type="dxa" w:w="130"/>
+            </w:tcMar>
+          </w:tcPr>
+          <w:p>
+            <w:r>
+              <w:rPr>
+                <w:rFonts w:ascii="Arial" w:cs="Arial" w:eastAsia="Arial" w:hAnsi="Arial"/>
+                <w:b w:val="false"/>
+                <w:bCs w:val="false"/>
+                <w:color w:val="1E293B"/>
+                <w:sz w:val="19"/>
+                <w:szCs w:val="19"/>
+              </w:rPr>
+              <w:t xml:space="preserve">Hold Open Palm; crisp virtual laser spotlight appears.</w:t>
+            </w:r>
+          </w:p>
+        </w:tc>
+      </w:tr>
+      <w:tr>
+        <w:tc>
+          <w:tcPr>
+            <w:tcW w:type="pct" w:w="25%"/>
+            <w:shd w:fill="F8FAFC" w:val="clear"/>
+            <w:tcMar>
+              <w:top w:type="dxa" w:w="90"/>
+              <w:left w:type="dxa" w:w="130"/>
+              <w:bottom w:type="dxa" w:w="90"/>
+              <w:right w:type="dxa" w:w="130"/>
+            </w:tcMar>
+          </w:tcPr>
+          <w:p>
+            <w:r>
+              <w:rPr>
+                <w:rFonts w:ascii="Arial" w:cs="Arial" w:eastAsia="Arial" w:hAnsi="Arial"/>
+                <w:b/>
+                <w:bCs/>
+                <w:color w:val="1E293B"/>
+                <w:sz w:val="19"/>
+                <w:szCs w:val="19"/>
+              </w:rPr>
+              <w:t xml:space="preserve">4. Q&amp;A Session</w:t>
+            </w:r>
+          </w:p>
+        </w:tc>
+        <w:tc>
+          <w:tcPr>
+            <w:tcW w:type="pct" w:w="38%"/>
+            <w:shd w:fill="F8FAFC" w:val="clear"/>
+            <w:tcMar>
+              <w:top w:type="dxa" w:w="90"/>
+              <w:left w:type="dxa" w:w="130"/>
+              <w:bottom w:type="dxa" w:w="90"/>
+              <w:right w:type="dxa" w:w="130"/>
+            </w:tcMar>
+          </w:tcPr>
+          <w:p>
+            <w:r>
+              <w:rPr>
+                <w:rFonts w:ascii="Arial" w:cs="Arial" w:eastAsia="Arial" w:hAnsi="Arial"/>
+                <w:b w:val="false"/>
+                <w:bCs w:val="false"/>
+                <w:color w:val="1E293B"/>
+                <w:sz w:val="19"/>
+                <w:szCs w:val="19"/>
+              </w:rPr>
+              <w:t xml:space="preserve">Click back repeatedly; remote gets placed down and lost.</w:t>
+            </w:r>
+          </w:p>
+        </w:tc>
+        <w:tc>
+          <w:tcPr>
+            <w:tcW w:type="pct" w:w="37%"/>
+            <w:shd w:fill="F8FAFC" w:val="clear"/>
+            <w:tcMar>
+              <w:top w:type="dxa" w:w="90"/>
+              <w:left w:type="dxa" w:w="130"/>
+              <w:bottom w:type="dxa" w:w="90"/>
+              <w:right w:type="dxa" w:w="130"/>
+            </w:tcMar>
+          </w:tcPr>
+          <w:p>
+            <w:r>
+              <w:rPr>
+                <w:rFonts w:ascii="Arial" w:cs="Arial" w:eastAsia="Arial" w:hAnsi="Arial"/>
+                <w:b w:val="false"/>
+                <w:bCs w:val="false"/>
+                <w:color w:val="1E293B"/>
+                <w:sz w:val="19"/>
+                <w:szCs w:val="19"/>
+              </w:rPr>
+              <w:t xml:space="preserve">Show Point Up gesture to step back instantly.</w:t>
+            </w:r>
+          </w:p>
+        </w:tc>
+      </w:tr>
+    </w:tbl>
     <w:p>
       <w:pPr>
         <w:pStyle w:val="Heading1"/>
-        <w:spacing w:after="100" w:before="240"/>
+        <w:spacing w:after="80" w:before="200"/>
       </w:pPr>
       <w:r>
         <w:rPr>
@@ -1319,12 +1646,117 @@
           <w:sz w:val="24"/>
           <w:szCs w:val="24"/>
         </w:rPr>
-        <w:t xml:space="preserve">5. Theoretical HCI Foundations &amp; Mathematical Derivations</w:t>
+        <w:t xml:space="preserve">5. Hierarchical Task Analysis (HTA) &amp; Error Recovery</w:t>
       </w:r>
     </w:p>
     <w:p>
       <w:pPr>
-        <w:spacing w:after="80" w:before="80"/>
+        <w:spacing w:after="70" w:before="70"/>
+      </w:pPr>
+      <w:r>
+        <w:rPr>
+          <w:b/>
+          <w:bCs/>
+          <w:sz w:val="20"/>
+          <w:szCs w:val="20"/>
+        </w:rPr>
+        <w:t xml:space="preserve">• Task 0: Deliver Presentation: </w:t>
+      </w:r>
+      <w:r>
+        <w:rPr>
+          <w:sz w:val="20"/>
+          <w:szCs w:val="20"/>
+        </w:rPr>
+        <w:t xml:space="preserve">Plan 0: Execute 1 (Setup), then repeatedly execute 2 (Slide Navigation) and optionally 3 (Laser Pointer) until conclusion. If an error occurs, execute 4 (Recovery).
+</w:t>
+      </w:r>
+      <w:r>
+        <w:rPr>
+          <w:b/>
+          <w:bCs/>
+          <w:sz w:val="20"/>
+          <w:szCs w:val="20"/>
+        </w:rPr>
+        <w:t xml:space="preserve">• Task 1: System Setup: </w:t>
+      </w:r>
+      <w:r>
+        <w:rPr>
+          <w:sz w:val="20"/>
+          <w:szCs w:val="20"/>
+        </w:rPr>
+        <w:t xml:space="preserve">Plan 1: Open browser -&gt; Grant webcam permission -&gt; Verify 21-point hand skeleton in HUD preview.
+</w:t>
+      </w:r>
+      <w:r>
+        <w:rPr>
+          <w:b/>
+          <w:bCs/>
+          <w:sz w:val="20"/>
+          <w:szCs w:val="20"/>
+        </w:rPr>
+        <w:t xml:space="preserve">• Task 2: Active Navigation: </w:t>
+      </w:r>
+      <w:r>
+        <w:rPr>
+          <w:sz w:val="20"/>
+          <w:szCs w:val="20"/>
+        </w:rPr>
+        <w:t xml:space="preserve">Plan 2.1: Flash Peace Sign (2 fingers) to advance. Plan 2.2: Flash Point Up (1 finger) to go back. Plan 2.3: Lower hand immediately during 2.0s cooldown.
+</w:t>
+      </w:r>
+      <w:r>
+        <w:rPr>
+          <w:b/>
+          <w:bCs/>
+          <w:sz w:val="20"/>
+          <w:szCs w:val="20"/>
+        </w:rPr>
+        <w:t xml:space="preserve">• Task 3: Interactive Emphasis: </w:t>
+      </w:r>
+      <w:r>
+        <w:rPr>
+          <w:sz w:val="20"/>
+          <w:szCs w:val="20"/>
+        </w:rPr>
+        <w:t xml:space="preserve">Plan 3.1: Hold Open Palm (5 fingers) to activate real-time laser spotlight. Plan 3.2: Drop hand to deactivate laser.
+</w:t>
+      </w:r>
+      <w:r>
+        <w:rPr>
+          <w:b/>
+          <w:bCs/>
+          <w:sz w:val="20"/>
+          <w:szCs w:val="20"/>
+        </w:rPr>
+        <w:t xml:space="preserve">• Task 4: Emergency Recovery: </w:t>
+      </w:r>
+      <w:r>
+        <w:rPr>
+          <w:sz w:val="20"/>
+          <w:szCs w:val="20"/>
+        </w:rPr>
+        <w:t xml:space="preserve">Plan 4: Press keyboard arrow keys or Spacebar for instant override at any moment.</w:t>
+      </w:r>
+    </w:p>
+    <w:p>
+      <w:pPr>
+        <w:pStyle w:val="Heading1"/>
+        <w:spacing w:after="80" w:before="200"/>
+      </w:pPr>
+      <w:r>
+        <w:rPr>
+          <w:b/>
+          <w:bCs/>
+          <w:color w:val="1E3A8A"/>
+          <w:sz w:val="24"/>
+          <w:szCs w:val="24"/>
+        </w:rPr>
+        <w:t xml:space="preserve">6. Theoretical HCI Foundations &amp; Mathematical Derivations</w:t>
+      </w:r>
+    </w:p>
+    <w:p>
+      <w:pPr>
+        <w:spacing w:after="70" w:before="70"/>
       </w:pPr>
       <w:r>
         <w:rPr>
@@ -1334,15 +1766,7 @@
           <w:sz w:val="21"/>
           <w:szCs w:val="21"/>
         </w:rPr>
-        <w:t xml:space="preserve">5.1 Fitts' Law in Free-Space Mid-Air Interaction
-</w:t>
-      </w:r>
-      <w:r>
-        <w:rPr>
-          <w:sz w:val="20"/>
-          <w:szCs w:val="20"/>
-        </w:rPr>
-        <w:t xml:space="preserve">Fitts' Law (Fitts, 1954) models the movement time (MT) required to rapidly acquire a target area of width W at distance D:
+        <w:t xml:space="preserve">6.1 Fitts' Law in Free-Space Mid-Air Interaction
 </w:t>
       </w:r>
       <w:r>
@@ -1350,20 +1774,19 @@
           <w:b/>
           <w:bCs/>
           <w:color w:val="1E3A8A"/>
-          <w:sz w:val="21"/>
-          <w:szCs w:val="21"/>
-        </w:rPr>
-        <w:t xml:space="preserve">MT = a + b · log₂(2D / W) = a + b · ID
-</w:t>
-      </w:r>
-      <w:r>
-        <w:rPr>
           <w:sz w:val="20"/>
           <w:szCs w:val="20"/>
         </w:rPr>
-        <w:t xml:space="preserve">In traditional mid-air gesture interfaces, forcing a presenter to steer their hand to a small virtual on-screen button is clumsy and tiring because target width W is small while distance D is large, resulting in a high Index of Difficulty (ID &gt; 4.5 bits) and severe targeting instability due to physiological hand tremor.
-• AirSlide Dimension Reduction: For slide switching, AirSlide eliminates 2D spatial coordinate targeting completely. The entire camera view acts as the detection zone. Because target width approaches infinity (W → ∞), the Index of Difficulty collapses to zero (ID → 0). Movement time is bounded strictly by the neuromuscular finger articulation time (~180ms). Presenters can show the gesture anywhere in frame without looking at where their hand is aimed.
-• Laser Pointing Stabilization: In laser pointer mode (Open Palm), where continuous 2D spatial pointing is required, AirSlide applies a velocity-scaled Exponential Moving Average (EMA) filter: S_t = α · Y_t + (1 - α) · S_{t-1}. Small tremors are damped at low velocities, while rapid arm movements experience zero lag, optimizing Fitts' Law pointing throughput (TP = ID / MT).
+        <w:t xml:space="preserve">Fitts' Law: MT = a + b · log₂(2D / W) = a + b · ID
+</w:t>
+      </w:r>
+      <w:r>
+        <w:rPr>
+          <w:sz w:val="20"/>
+          <w:szCs w:val="20"/>
+        </w:rPr>
+        <w:t xml:space="preserve">• AirSlide Dimension Reduction: For slide switching, AirSlide eliminates 2D spatial coordinate targeting completely. The entire camera view acts as the detection zone. Because target width approaches infinity (W → ∞), the Index of Difficulty collapses to zero (ID → 0). Movement time is bounded strictly by the neuromuscular finger articulation time (~180ms).
+• Laser Pointing Stabilization: In laser pointer mode (Open Palm), AirSlide applies a velocity-scaled Exponential Moving Average (EMA) filter: S_t = α · Y_t + (1 - α) · S_{t-1}. Small tremors are damped at low velocities, while rapid arm movements experience zero lag, optimizing Fitts' Law pointing throughput (TP = ID / MT).
 </w:t>
       </w:r>
       <w:r>
@@ -1374,15 +1797,7 @@
           <w:sz w:val="21"/>
           <w:szCs w:val="21"/>
         </w:rPr>
-        <w:t xml:space="preserve">5.2 Hick-Hyman Law &amp; Cognitive Decision Latency
-</w:t>
-      </w:r>
-      <w:r>
-        <w:rPr>
-          <w:sz w:val="20"/>
-          <w:szCs w:val="20"/>
-        </w:rPr>
-        <w:t xml:space="preserve">The Hick-Hyman Law (Hick, 1952; Hyman, 1953) dictates that the cognitive reaction time (RT) required for a user to choose among n possible alternatives increases logarithmically:
+        <w:t xml:space="preserve">6.2 Hick-Hyman Law &amp; Cognitive Decision Latency
 </w:t>
       </w:r>
       <w:r>
@@ -1390,26 +1805,24 @@
           <w:b/>
           <w:bCs/>
           <w:color w:val="1E3A8A"/>
-          <w:sz w:val="21"/>
-          <w:szCs w:val="21"/>
-        </w:rPr>
-        <w:t xml:space="preserve">RT = b · log₂(n + 1)
-</w:t>
-      </w:r>
-      <w:r>
-        <w:rPr>
           <w:sz w:val="20"/>
           <w:szCs w:val="20"/>
         </w:rPr>
-        <w:t xml:space="preserve">During active public speaking, the presenter's working memory is almost fully occupied by verbal speech generation. If a gesture system presents a large vocabulary of 15–20 complex gestures, Hick's Law predicts a dramatic increase in cognitive decision latency (RT &gt; 450ms), causing awkward verbal pauses and high gesture recall error rates.
-• AirSlide 4-Gesture Vocabulary: AirSlide restricts the active gesture set to exactly n = 4 mutually orthogonal postures (Entropy H ≈ 2.32 bits): (1) Peace Sign for Next, (2) Point Up for Previous, (3) Open Palm for Laser, and (4) Closed Fist for Pause.
-• Natural Ordinal Mapping: Because finger counts mirror natural ordinal logic (1 finger = step back/1st, 2 fingers = step forward/2nd, 5 fingers = full spotlight, 0 fingers = close/stop), presenter reaction time RT is measured empirically at under 190ms, enabling subconscious execution without speech hesitation.</w:t>
+        <w:t xml:space="preserve">Hick's Law: RT = b · log₂(n + 1)
+</w:t>
+      </w:r>
+      <w:r>
+        <w:rPr>
+          <w:sz w:val="20"/>
+          <w:szCs w:val="20"/>
+        </w:rPr>
+        <w:t xml:space="preserve">AirSlide restricts the active gesture set to exactly n = 4 mutually orthogonal postures (Entropy H ≈ 2.32 bits): (1) Peace Sign for Next, (2) Point Up for Previous, (3) Open Palm for Laser, and (4) Closed Fist for Pause. Because finger counts mirror natural ordinal logic (1 finger = step back/1st, 2 fingers = step forward/2nd, 5 fingers = full spotlight, 0 fingers = close/stop), presenter reaction time RT is measured empirically at under 190ms, enabling subconscious execution without speech hesitation.</w:t>
       </w:r>
     </w:p>
     <w:p>
       <w:pPr>
         <w:pStyle w:val="Heading1"/>
-        <w:spacing w:after="100" w:before="240"/>
+        <w:spacing w:after="80" w:before="200"/>
       </w:pPr>
       <w:r>
         <w:rPr>
@@ -1419,55 +1832,68 @@
           <w:sz w:val="24"/>
           <w:szCs w:val="24"/>
         </w:rPr>
-        <w:t xml:space="preserve">6. Motor Ergonomics &amp; Physical Human Factors</w:t>
+        <w:t xml:space="preserve">7. Motor Ergonomics &amp; Norman's Action Cycle</w:t>
       </w:r>
     </w:p>
     <w:p>
       <w:pPr>
-        <w:spacing w:after="80" w:before="80"/>
+        <w:spacing w:after="70" w:before="70"/>
       </w:pPr>
       <w:r>
         <w:rPr>
           <w:b/>
           <w:bCs/>
-          <w:color w:val="2563EB"/>
-          <w:sz w:val="21"/>
-          <w:szCs w:val="21"/>
-        </w:rPr>
-        <w:t xml:space="preserve">6.1 Solving 'Gorilla Arm' Fatigue Syndrome
-</w:t>
-      </w:r>
-      <w:r>
-        <w:rPr>
           <w:sz w:val="20"/>
           <w:szCs w:val="20"/>
         </w:rPr>
-        <w:t xml:space="preserve">A well-documented failure mode of free-space Natural User Interfaces (NUI) is 'Gorilla Arm' syndrome—acute muscular fatigue in the anterior deltoid and upper trapezius caused by holding the arm extended in mid-air for prolonged periods. AirSlide eliminates this through a micro-gestural interaction model: presenters only raise their hand for a brief half-second flash (&lt;350ms) to trigger a slide turn, then immediately drop their arm back down to a relaxed resting position.
+        <w:t xml:space="preserve">• Gorilla Arm Fatigue Elimination: </w:t>
+      </w:r>
+      <w:r>
+        <w:rPr>
+          <w:sz w:val="20"/>
+          <w:szCs w:val="20"/>
+        </w:rPr>
+        <w:t xml:space="preserve">Presenters only raise their hand for a brief half-second flash (&lt;350ms) to trigger a slide turn, then immediately drop their arm back down to rest.
 </w:t>
       </w:r>
       <w:r>
         <w:rPr>
           <w:b/>
           <w:bCs/>
-          <w:color w:val="2563EB"/>
-          <w:sz w:val="21"/>
-          <w:szCs w:val="21"/>
-        </w:rPr>
-        <w:t xml:space="preserve">6.2 Solving the 'Midas Touch' Problem
-</w:t>
-      </w:r>
-      <w:r>
-        <w:rPr>
           <w:sz w:val="20"/>
           <w:szCs w:val="20"/>
         </w:rPr>
-        <w:t xml:space="preserve">When a presenter lowers their arm back to rest, the downward motion and changing finger positions could easily be misclassified as secondary gesture commands. AirSlide implements a 2.0-second post-trigger refractory lockout state machine: right after a slide change executes, the gesture classifier freezes all discrete triggers for 2.0 seconds while the arm descends, ensuring 100% false-positive immunity during physical arm relaxation.</w:t>
+        <w:t xml:space="preserve">• Midas Touch Solution: </w:t>
+      </w:r>
+      <w:r>
+        <w:rPr>
+          <w:sz w:val="20"/>
+          <w:szCs w:val="20"/>
+        </w:rPr>
+        <w:t xml:space="preserve">AirSlide enforces a 2.0-second post-trigger refractory lockout state machine: right after a slide change executes, the classifier ignores all movements while the arm returns to rest.
+</w:t>
+      </w:r>
+      <w:r>
+        <w:rPr>
+          <w:b/>
+          <w:bCs/>
+          <w:sz w:val="20"/>
+          <w:szCs w:val="20"/>
+        </w:rPr>
+        <w:t xml:space="preserve">• Norman's Action Cycle: </w:t>
+      </w:r>
+      <w:r>
+        <w:rPr>
+          <w:sz w:val="20"/>
+          <w:szCs w:val="20"/>
+        </w:rPr>
+        <w:t xml:space="preserve">Gulf of Execution is bridged by intuitive finger counting; Gulf of Evaluation is bridged by real-time skeletal feedback, instant 0ms slide animations, and a radial cooldown ring.</w:t>
       </w:r>
     </w:p>
     <w:p>
       <w:pPr>
         <w:pStyle w:val="Heading1"/>
-        <w:spacing w:after="100" w:before="240"/>
+        <w:spacing w:after="80" w:before="200"/>
       </w:pPr>
       <w:r>
         <w:rPr>
@@ -1477,21 +1903,7 @@
           <w:sz w:val="24"/>
           <w:szCs w:val="24"/>
         </w:rPr>
-        <w:t xml:space="preserve">7. Dialogue Model, Finite State Machine &amp; Vision Pipeline</w:t>
-      </w:r>
-    </w:p>
-    <w:p>
-      <w:pPr>
-        <w:spacing w:after="80" w:before="80"/>
-      </w:pPr>
-      <w:r>
-        <w:rPr>
-          <w:b/>
-          <w:bCs/>
-          <w:sz w:val="19"/>
-          <w:szCs w:val="19"/>
-        </w:rPr>
-        <w:t xml:space="preserve">Table 2: Finite State Machine (FSM) Transition Logic</w:t>
+        <w:t xml:space="preserve">8. Dialogue Model, Finite State Machine &amp; Vision Pipeline</w:t>
       </w:r>
     </w:p>
     <w:tbl>
@@ -1518,10 +1930,10 @@
             <w:tcW w:type="pct" w:w="20%"/>
             <w:shd w:fill="1E3A8A" w:val="clear"/>
             <w:tcMar>
-              <w:top w:type="dxa" w:w="100"/>
-              <w:left w:type="dxa" w:w="140"/>
-              <w:bottom w:type="dxa" w:w="100"/>
-              <w:right w:type="dxa" w:w="140"/>
+              <w:top w:type="dxa" w:w="90"/>
+              <w:left w:type="dxa" w:w="130"/>
+              <w:bottom w:type="dxa" w:w="90"/>
+              <w:right w:type="dxa" w:w="130"/>
             </w:tcMar>
           </w:tcPr>
           <w:p>
@@ -1543,10 +1955,10 @@
             <w:tcW w:type="pct" w:w="30%"/>
             <w:shd w:fill="1E3A8A" w:val="clear"/>
             <w:tcMar>
-              <w:top w:type="dxa" w:w="100"/>
-              <w:left w:type="dxa" w:w="140"/>
-              <w:bottom w:type="dxa" w:w="100"/>
-              <w:right w:type="dxa" w:w="140"/>
+              <w:top w:type="dxa" w:w="90"/>
+              <w:left w:type="dxa" w:w="130"/>
+              <w:bottom w:type="dxa" w:w="90"/>
+              <w:right w:type="dxa" w:w="130"/>
             </w:tcMar>
           </w:tcPr>
           <w:p>
@@ -1568,10 +1980,10 @@
             <w:tcW w:type="pct" w:w="28%"/>
             <w:shd w:fill="1E3A8A" w:val="clear"/>
             <w:tcMar>
-              <w:top w:type="dxa" w:w="100"/>
-              <w:left w:type="dxa" w:w="140"/>
-              <w:bottom w:type="dxa" w:w="100"/>
-              <w:right w:type="dxa" w:w="140"/>
+              <w:top w:type="dxa" w:w="90"/>
+              <w:left w:type="dxa" w:w="130"/>
+              <w:bottom w:type="dxa" w:w="90"/>
+              <w:right w:type="dxa" w:w="130"/>
             </w:tcMar>
           </w:tcPr>
           <w:p>
@@ -1593,10 +2005,10 @@
             <w:tcW w:type="pct" w:w="22%"/>
             <w:shd w:fill="1E3A8A" w:val="clear"/>
             <w:tcMar>
-              <w:top w:type="dxa" w:w="100"/>
-              <w:left w:type="dxa" w:w="140"/>
-              <w:bottom w:type="dxa" w:w="100"/>
-              <w:right w:type="dxa" w:w="140"/>
+              <w:top w:type="dxa" w:w="90"/>
+              <w:left w:type="dxa" w:w="130"/>
+              <w:bottom w:type="dxa" w:w="90"/>
+              <w:right w:type="dxa" w:w="130"/>
             </w:tcMar>
           </w:tcPr>
           <w:p>
@@ -1620,10 +2032,10 @@
             <w:tcW w:type="pct" w:w="20%"/>
             <w:shd w:fill="F8FAFC" w:val="clear"/>
             <w:tcMar>
-              <w:top w:type="dxa" w:w="100"/>
-              <w:left w:type="dxa" w:w="140"/>
-              <w:bottom w:type="dxa" w:w="100"/>
-              <w:right w:type="dxa" w:w="140"/>
+              <w:top w:type="dxa" w:w="90"/>
+              <w:left w:type="dxa" w:w="130"/>
+              <w:bottom w:type="dxa" w:w="90"/>
+              <w:right w:type="dxa" w:w="130"/>
             </w:tcMar>
           </w:tcPr>
           <w:p>
@@ -1645,10 +2057,10 @@
             <w:tcW w:type="pct" w:w="30%"/>
             <w:shd w:fill="F8FAFC" w:val="clear"/>
             <w:tcMar>
-              <w:top w:type="dxa" w:w="100"/>
-              <w:left w:type="dxa" w:w="140"/>
-              <w:bottom w:type="dxa" w:w="100"/>
-              <w:right w:type="dxa" w:w="140"/>
+              <w:top w:type="dxa" w:w="90"/>
+              <w:left w:type="dxa" w:w="130"/>
+              <w:bottom w:type="dxa" w:w="90"/>
+              <w:right w:type="dxa" w:w="130"/>
             </w:tcMar>
           </w:tcPr>
           <w:p>
@@ -1670,10 +2082,10 @@
             <w:tcW w:type="pct" w:w="28%"/>
             <w:shd w:fill="F8FAFC" w:val="clear"/>
             <w:tcMar>
-              <w:top w:type="dxa" w:w="100"/>
-              <w:left w:type="dxa" w:w="140"/>
-              <w:bottom w:type="dxa" w:w="100"/>
-              <w:right w:type="dxa" w:w="140"/>
+              <w:top w:type="dxa" w:w="90"/>
+              <w:left w:type="dxa" w:w="130"/>
+              <w:bottom w:type="dxa" w:w="90"/>
+              <w:right w:type="dxa" w:w="130"/>
             </w:tcMar>
           </w:tcPr>
           <w:p>
@@ -1695,10 +2107,10 @@
             <w:tcW w:type="pct" w:w="22%"/>
             <w:shd w:fill="F8FAFC" w:val="clear"/>
             <w:tcMar>
-              <w:top w:type="dxa" w:w="100"/>
-              <w:left w:type="dxa" w:w="140"/>
-              <w:bottom w:type="dxa" w:w="100"/>
-              <w:right w:type="dxa" w:w="140"/>
+              <w:top w:type="dxa" w:w="90"/>
+              <w:left w:type="dxa" w:w="130"/>
+              <w:bottom w:type="dxa" w:w="90"/>
+              <w:right w:type="dxa" w:w="130"/>
             </w:tcMar>
           </w:tcPr>
           <w:p>
@@ -1722,10 +2134,10 @@
             <w:tcW w:type="pct" w:w="20%"/>
             <w:shd w:fill="F8FAFC" w:val="clear"/>
             <w:tcMar>
-              <w:top w:type="dxa" w:w="100"/>
-              <w:left w:type="dxa" w:w="140"/>
-              <w:bottom w:type="dxa" w:w="100"/>
-              <w:right w:type="dxa" w:w="140"/>
+              <w:top w:type="dxa" w:w="90"/>
+              <w:left w:type="dxa" w:w="130"/>
+              <w:bottom w:type="dxa" w:w="90"/>
+              <w:right w:type="dxa" w:w="130"/>
             </w:tcMar>
           </w:tcPr>
           <w:p>
@@ -1747,10 +2159,10 @@
             <w:tcW w:type="pct" w:w="30%"/>
             <w:shd w:fill="F8FAFC" w:val="clear"/>
             <w:tcMar>
-              <w:top w:type="dxa" w:w="100"/>
-              <w:left w:type="dxa" w:w="140"/>
-              <w:bottom w:type="dxa" w:w="100"/>
-              <w:right w:type="dxa" w:w="140"/>
+              <w:top w:type="dxa" w:w="90"/>
+              <w:left w:type="dxa" w:w="130"/>
+              <w:bottom w:type="dxa" w:w="90"/>
+              <w:right w:type="dxa" w:w="130"/>
             </w:tcMar>
           </w:tcPr>
           <w:p>
@@ -1772,10 +2184,10 @@
             <w:tcW w:type="pct" w:w="28%"/>
             <w:shd w:fill="F8FAFC" w:val="clear"/>
             <w:tcMar>
-              <w:top w:type="dxa" w:w="100"/>
-              <w:left w:type="dxa" w:w="140"/>
-              <w:bottom w:type="dxa" w:w="100"/>
-              <w:right w:type="dxa" w:w="140"/>
+              <w:top w:type="dxa" w:w="90"/>
+              <w:left w:type="dxa" w:w="130"/>
+              <w:bottom w:type="dxa" w:w="90"/>
+              <w:right w:type="dxa" w:w="130"/>
             </w:tcMar>
           </w:tcPr>
           <w:p>
@@ -1797,10 +2209,10 @@
             <w:tcW w:type="pct" w:w="22%"/>
             <w:shd w:fill="F8FAFC" w:val="clear"/>
             <w:tcMar>
-              <w:top w:type="dxa" w:w="100"/>
-              <w:left w:type="dxa" w:w="140"/>
-              <w:bottom w:type="dxa" w:w="100"/>
-              <w:right w:type="dxa" w:w="140"/>
+              <w:top w:type="dxa" w:w="90"/>
+              <w:left w:type="dxa" w:w="130"/>
+              <w:bottom w:type="dxa" w:w="90"/>
+              <w:right w:type="dxa" w:w="130"/>
             </w:tcMar>
           </w:tcPr>
           <w:p>
@@ -1824,10 +2236,10 @@
             <w:tcW w:type="pct" w:w="20%"/>
             <w:shd w:fill="F8FAFC" w:val="clear"/>
             <w:tcMar>
-              <w:top w:type="dxa" w:w="100"/>
-              <w:left w:type="dxa" w:w="140"/>
-              <w:bottom w:type="dxa" w:w="100"/>
-              <w:right w:type="dxa" w:w="140"/>
+              <w:top w:type="dxa" w:w="90"/>
+              <w:left w:type="dxa" w:w="130"/>
+              <w:bottom w:type="dxa" w:w="90"/>
+              <w:right w:type="dxa" w:w="130"/>
             </w:tcMar>
           </w:tcPr>
           <w:p>
@@ -1849,10 +2261,10 @@
             <w:tcW w:type="pct" w:w="30%"/>
             <w:shd w:fill="F8FAFC" w:val="clear"/>
             <w:tcMar>
-              <w:top w:type="dxa" w:w="100"/>
-              <w:left w:type="dxa" w:w="140"/>
-              <w:bottom w:type="dxa" w:w="100"/>
-              <w:right w:type="dxa" w:w="140"/>
+              <w:top w:type="dxa" w:w="90"/>
+              <w:left w:type="dxa" w:w="130"/>
+              <w:bottom w:type="dxa" w:w="90"/>
+              <w:right w:type="dxa" w:w="130"/>
             </w:tcMar>
           </w:tcPr>
           <w:p>
@@ -1874,10 +2286,10 @@
             <w:tcW w:type="pct" w:w="28%"/>
             <w:shd w:fill="F8FAFC" w:val="clear"/>
             <w:tcMar>
-              <w:top w:type="dxa" w:w="100"/>
-              <w:left w:type="dxa" w:w="140"/>
-              <w:bottom w:type="dxa" w:w="100"/>
-              <w:right w:type="dxa" w:w="140"/>
+              <w:top w:type="dxa" w:w="90"/>
+              <w:left w:type="dxa" w:w="130"/>
+              <w:bottom w:type="dxa" w:w="90"/>
+              <w:right w:type="dxa" w:w="130"/>
             </w:tcMar>
           </w:tcPr>
           <w:p>
@@ -1899,10 +2311,10 @@
             <w:tcW w:type="pct" w:w="22%"/>
             <w:shd w:fill="F8FAFC" w:val="clear"/>
             <w:tcMar>
-              <w:top w:type="dxa" w:w="100"/>
-              <w:left w:type="dxa" w:w="140"/>
-              <w:bottom w:type="dxa" w:w="100"/>
-              <w:right w:type="dxa" w:w="140"/>
+              <w:top w:type="dxa" w:w="90"/>
+              <w:left w:type="dxa" w:w="130"/>
+              <w:bottom w:type="dxa" w:w="90"/>
+              <w:right w:type="dxa" w:w="130"/>
             </w:tcMar>
           </w:tcPr>
           <w:p>
@@ -1926,10 +2338,10 @@
             <w:tcW w:type="pct" w:w="20%"/>
             <w:shd w:fill="F8FAFC" w:val="clear"/>
             <w:tcMar>
-              <w:top w:type="dxa" w:w="100"/>
-              <w:left w:type="dxa" w:w="140"/>
-              <w:bottom w:type="dxa" w:w="100"/>
-              <w:right w:type="dxa" w:w="140"/>
+              <w:top w:type="dxa" w:w="90"/>
+              <w:left w:type="dxa" w:w="130"/>
+              <w:bottom w:type="dxa" w:w="90"/>
+              <w:right w:type="dxa" w:w="130"/>
             </w:tcMar>
           </w:tcPr>
           <w:p>
@@ -1951,10 +2363,10 @@
             <w:tcW w:type="pct" w:w="30%"/>
             <w:shd w:fill="F8FAFC" w:val="clear"/>
             <w:tcMar>
-              <w:top w:type="dxa" w:w="100"/>
-              <w:left w:type="dxa" w:w="140"/>
-              <w:bottom w:type="dxa" w:w="100"/>
-              <w:right w:type="dxa" w:w="140"/>
+              <w:top w:type="dxa" w:w="90"/>
+              <w:left w:type="dxa" w:w="130"/>
+              <w:bottom w:type="dxa" w:w="90"/>
+              <w:right w:type="dxa" w:w="130"/>
             </w:tcMar>
           </w:tcPr>
           <w:p>
@@ -1976,10 +2388,10 @@
             <w:tcW w:type="pct" w:w="28%"/>
             <w:shd w:fill="F8FAFC" w:val="clear"/>
             <w:tcMar>
-              <w:top w:type="dxa" w:w="100"/>
-              <w:left w:type="dxa" w:w="140"/>
-              <w:bottom w:type="dxa" w:w="100"/>
-              <w:right w:type="dxa" w:w="140"/>
+              <w:top w:type="dxa" w:w="90"/>
+              <w:left w:type="dxa" w:w="130"/>
+              <w:bottom w:type="dxa" w:w="90"/>
+              <w:right w:type="dxa" w:w="130"/>
             </w:tcMar>
           </w:tcPr>
           <w:p>
@@ -2001,10 +2413,10 @@
             <w:tcW w:type="pct" w:w="22%"/>
             <w:shd w:fill="F8FAFC" w:val="clear"/>
             <w:tcMar>
-              <w:top w:type="dxa" w:w="100"/>
-              <w:left w:type="dxa" w:w="140"/>
-              <w:bottom w:type="dxa" w:w="100"/>
-              <w:right w:type="dxa" w:w="140"/>
+              <w:top w:type="dxa" w:w="90"/>
+              <w:left w:type="dxa" w:w="130"/>
+              <w:bottom w:type="dxa" w:w="90"/>
+              <w:right w:type="dxa" w:w="130"/>
             </w:tcMar>
           </w:tcPr>
           <w:p>
@@ -2028,10 +2440,10 @@
             <w:tcW w:type="pct" w:w="20%"/>
             <w:shd w:fill="F8FAFC" w:val="clear"/>
             <w:tcMar>
-              <w:top w:type="dxa" w:w="100"/>
-              <w:left w:type="dxa" w:w="140"/>
-              <w:bottom w:type="dxa" w:w="100"/>
-              <w:right w:type="dxa" w:w="140"/>
+              <w:top w:type="dxa" w:w="90"/>
+              <w:left w:type="dxa" w:w="130"/>
+              <w:bottom w:type="dxa" w:w="90"/>
+              <w:right w:type="dxa" w:w="130"/>
             </w:tcMar>
           </w:tcPr>
           <w:p>
@@ -2053,10 +2465,10 @@
             <w:tcW w:type="pct" w:w="30%"/>
             <w:shd w:fill="F8FAFC" w:val="clear"/>
             <w:tcMar>
-              <w:top w:type="dxa" w:w="100"/>
-              <w:left w:type="dxa" w:w="140"/>
-              <w:bottom w:type="dxa" w:w="100"/>
-              <w:right w:type="dxa" w:w="140"/>
+              <w:top w:type="dxa" w:w="90"/>
+              <w:left w:type="dxa" w:w="130"/>
+              <w:bottom w:type="dxa" w:w="90"/>
+              <w:right w:type="dxa" w:w="130"/>
             </w:tcMar>
           </w:tcPr>
           <w:p>
@@ -2078,10 +2490,10 @@
             <w:tcW w:type="pct" w:w="28%"/>
             <w:shd w:fill="F8FAFC" w:val="clear"/>
             <w:tcMar>
-              <w:top w:type="dxa" w:w="100"/>
-              <w:left w:type="dxa" w:w="140"/>
-              <w:bottom w:type="dxa" w:w="100"/>
-              <w:right w:type="dxa" w:w="140"/>
+              <w:top w:type="dxa" w:w="90"/>
+              <w:left w:type="dxa" w:w="130"/>
+              <w:bottom w:type="dxa" w:w="90"/>
+              <w:right w:type="dxa" w:w="130"/>
             </w:tcMar>
           </w:tcPr>
           <w:p>
@@ -2103,10 +2515,10 @@
             <w:tcW w:type="pct" w:w="22%"/>
             <w:shd w:fill="F8FAFC" w:val="clear"/>
             <w:tcMar>
-              <w:top w:type="dxa" w:w="100"/>
-              <w:left w:type="dxa" w:w="140"/>
-              <w:bottom w:type="dxa" w:w="100"/>
-              <w:right w:type="dxa" w:w="140"/>
+              <w:top w:type="dxa" w:w="90"/>
+              <w:left w:type="dxa" w:w="130"/>
+              <w:bottom w:type="dxa" w:w="90"/>
+              <w:right w:type="dxa" w:w="130"/>
             </w:tcMar>
           </w:tcPr>
           <w:p>
@@ -2128,7 +2540,7 @@
     <w:p>
       <w:pPr>
         <w:pStyle w:val="Heading1"/>
-        <w:spacing w:after="100" w:before="240"/>
+        <w:spacing w:after="80" w:before="200"/>
       </w:pPr>
       <w:r>
         <w:rPr>
@@ -2138,7 +2550,7 @@
           <w:sz w:val="24"/>
           <w:szCs w:val="24"/>
         </w:rPr>
-        <w:t xml:space="preserve">8. Nielsen's Ten Usability Heuristics Compliance Audit</w:t>
+        <w:t xml:space="preserve">9. Nielsen's Ten Usability Heuristics Compliance Audit</w:t>
       </w:r>
     </w:p>
     <w:tbl>
@@ -2164,10 +2576,10 @@
             <w:tcW w:type="pct" w:w="26%"/>
             <w:shd w:fill="1E3A8A" w:val="clear"/>
             <w:tcMar>
-              <w:top w:type="dxa" w:w="100"/>
-              <w:left w:type="dxa" w:w="140"/>
-              <w:bottom w:type="dxa" w:w="100"/>
-              <w:right w:type="dxa" w:w="140"/>
+              <w:top w:type="dxa" w:w="90"/>
+              <w:left w:type="dxa" w:w="130"/>
+              <w:bottom w:type="dxa" w:w="90"/>
+              <w:right w:type="dxa" w:w="130"/>
             </w:tcMar>
           </w:tcPr>
           <w:p>
@@ -2189,10 +2601,10 @@
             <w:tcW w:type="pct" w:w="48%"/>
             <w:shd w:fill="1E3A8A" w:val="clear"/>
             <w:tcMar>
-              <w:top w:type="dxa" w:w="100"/>
-              <w:left w:type="dxa" w:w="140"/>
-              <w:bottom w:type="dxa" w:w="100"/>
-              <w:right w:type="dxa" w:w="140"/>
+              <w:top w:type="dxa" w:w="90"/>
+              <w:left w:type="dxa" w:w="130"/>
+              <w:bottom w:type="dxa" w:w="90"/>
+              <w:right w:type="dxa" w:w="130"/>
             </w:tcMar>
           </w:tcPr>
           <w:p>
@@ -2214,10 +2626,10 @@
             <w:tcW w:type="pct" w:w="26%"/>
             <w:shd w:fill="1E3A8A" w:val="clear"/>
             <w:tcMar>
-              <w:top w:type="dxa" w:w="100"/>
-              <w:left w:type="dxa" w:w="140"/>
-              <w:bottom w:type="dxa" w:w="100"/>
-              <w:right w:type="dxa" w:w="140"/>
+              <w:top w:type="dxa" w:w="90"/>
+              <w:left w:type="dxa" w:w="130"/>
+              <w:bottom w:type="dxa" w:w="90"/>
+              <w:right w:type="dxa" w:w="130"/>
             </w:tcMar>
           </w:tcPr>
           <w:p>
@@ -2241,10 +2653,10 @@
             <w:tcW w:type="pct" w:w="26%"/>
             <w:shd w:fill="F8FAFC" w:val="clear"/>
             <w:tcMar>
-              <w:top w:type="dxa" w:w="100"/>
-              <w:left w:type="dxa" w:w="140"/>
-              <w:bottom w:type="dxa" w:w="100"/>
-              <w:right w:type="dxa" w:w="140"/>
+              <w:top w:type="dxa" w:w="90"/>
+              <w:left w:type="dxa" w:w="130"/>
+              <w:bottom w:type="dxa" w:w="90"/>
+              <w:right w:type="dxa" w:w="130"/>
             </w:tcMar>
           </w:tcPr>
           <w:p>
@@ -2266,10 +2678,10 @@
             <w:tcW w:type="pct" w:w="48%"/>
             <w:shd w:fill="F8FAFC" w:val="clear"/>
             <w:tcMar>
-              <w:top w:type="dxa" w:w="100"/>
-              <w:left w:type="dxa" w:w="140"/>
-              <w:bottom w:type="dxa" w:w="100"/>
-              <w:right w:type="dxa" w:w="140"/>
+              <w:top w:type="dxa" w:w="90"/>
+              <w:left w:type="dxa" w:w="130"/>
+              <w:bottom w:type="dxa" w:w="90"/>
+              <w:right w:type="dxa" w:w="130"/>
             </w:tcMar>
           </w:tcPr>
           <w:p>
@@ -2291,10 +2703,10 @@
             <w:tcW w:type="pct" w:w="26%"/>
             <w:shd w:fill="F8FAFC" w:val="clear"/>
             <w:tcMar>
-              <w:top w:type="dxa" w:w="100"/>
-              <w:left w:type="dxa" w:w="140"/>
-              <w:bottom w:type="dxa" w:w="100"/>
-              <w:right w:type="dxa" w:w="140"/>
+              <w:top w:type="dxa" w:w="90"/>
+              <w:left w:type="dxa" w:w="130"/>
+              <w:bottom w:type="dxa" w:w="90"/>
+              <w:right w:type="dxa" w:w="130"/>
             </w:tcMar>
           </w:tcPr>
           <w:p>
@@ -2318,10 +2730,10 @@
             <w:tcW w:type="pct" w:w="26%"/>
             <w:shd w:fill="F8FAFC" w:val="clear"/>
             <w:tcMar>
-              <w:top w:type="dxa" w:w="100"/>
-              <w:left w:type="dxa" w:w="140"/>
-              <w:bottom w:type="dxa" w:w="100"/>
-              <w:right w:type="dxa" w:w="140"/>
+              <w:top w:type="dxa" w:w="90"/>
+              <w:left w:type="dxa" w:w="130"/>
+              <w:bottom w:type="dxa" w:w="90"/>
+              <w:right w:type="dxa" w:w="130"/>
             </w:tcMar>
           </w:tcPr>
           <w:p>
@@ -2343,10 +2755,10 @@
             <w:tcW w:type="pct" w:w="48%"/>
             <w:shd w:fill="F8FAFC" w:val="clear"/>
             <w:tcMar>
-              <w:top w:type="dxa" w:w="100"/>
-              <w:left w:type="dxa" w:w="140"/>
-              <w:bottom w:type="dxa" w:w="100"/>
-              <w:right w:type="dxa" w:w="140"/>
+              <w:top w:type="dxa" w:w="90"/>
+              <w:left w:type="dxa" w:w="130"/>
+              <w:bottom w:type="dxa" w:w="90"/>
+              <w:right w:type="dxa" w:w="130"/>
             </w:tcMar>
           </w:tcPr>
           <w:p>
@@ -2368,10 +2780,10 @@
             <w:tcW w:type="pct" w:w="26%"/>
             <w:shd w:fill="F8FAFC" w:val="clear"/>
             <w:tcMar>
-              <w:top w:type="dxa" w:w="100"/>
-              <w:left w:type="dxa" w:w="140"/>
-              <w:bottom w:type="dxa" w:w="100"/>
-              <w:right w:type="dxa" w:w="140"/>
+              <w:top w:type="dxa" w:w="90"/>
+              <w:left w:type="dxa" w:w="130"/>
+              <w:bottom w:type="dxa" w:w="90"/>
+              <w:right w:type="dxa" w:w="130"/>
             </w:tcMar>
           </w:tcPr>
           <w:p>
@@ -2395,10 +2807,10 @@
             <w:tcW w:type="pct" w:w="26%"/>
             <w:shd w:fill="F8FAFC" w:val="clear"/>
             <w:tcMar>
-              <w:top w:type="dxa" w:w="100"/>
-              <w:left w:type="dxa" w:w="140"/>
-              <w:bottom w:type="dxa" w:w="100"/>
-              <w:right w:type="dxa" w:w="140"/>
+              <w:top w:type="dxa" w:w="90"/>
+              <w:left w:type="dxa" w:w="130"/>
+              <w:bottom w:type="dxa" w:w="90"/>
+              <w:right w:type="dxa" w:w="130"/>
             </w:tcMar>
           </w:tcPr>
           <w:p>
@@ -2420,10 +2832,10 @@
             <w:tcW w:type="pct" w:w="48%"/>
             <w:shd w:fill="F8FAFC" w:val="clear"/>
             <w:tcMar>
-              <w:top w:type="dxa" w:w="100"/>
-              <w:left w:type="dxa" w:w="140"/>
-              <w:bottom w:type="dxa" w:w="100"/>
-              <w:right w:type="dxa" w:w="140"/>
+              <w:top w:type="dxa" w:w="90"/>
+              <w:left w:type="dxa" w:w="130"/>
+              <w:bottom w:type="dxa" w:w="90"/>
+              <w:right w:type="dxa" w:w="130"/>
             </w:tcMar>
           </w:tcPr>
           <w:p>
@@ -2445,10 +2857,10 @@
             <w:tcW w:type="pct" w:w="26%"/>
             <w:shd w:fill="F8FAFC" w:val="clear"/>
             <w:tcMar>
-              <w:top w:type="dxa" w:w="100"/>
-              <w:left w:type="dxa" w:w="140"/>
-              <w:bottom w:type="dxa" w:w="100"/>
-              <w:right w:type="dxa" w:w="140"/>
+              <w:top w:type="dxa" w:w="90"/>
+              <w:left w:type="dxa" w:w="130"/>
+              <w:bottom w:type="dxa" w:w="90"/>
+              <w:right w:type="dxa" w:w="130"/>
             </w:tcMar>
           </w:tcPr>
           <w:p>
@@ -2472,10 +2884,10 @@
             <w:tcW w:type="pct" w:w="26%"/>
             <w:shd w:fill="F8FAFC" w:val="clear"/>
             <w:tcMar>
-              <w:top w:type="dxa" w:w="100"/>
-              <w:left w:type="dxa" w:w="140"/>
-              <w:bottom w:type="dxa" w:w="100"/>
-              <w:right w:type="dxa" w:w="140"/>
+              <w:top w:type="dxa" w:w="90"/>
+              <w:left w:type="dxa" w:w="130"/>
+              <w:bottom w:type="dxa" w:w="90"/>
+              <w:right w:type="dxa" w:w="130"/>
             </w:tcMar>
           </w:tcPr>
           <w:p>
@@ -2497,10 +2909,10 @@
             <w:tcW w:type="pct" w:w="48%"/>
             <w:shd w:fill="F8FAFC" w:val="clear"/>
             <w:tcMar>
-              <w:top w:type="dxa" w:w="100"/>
-              <w:left w:type="dxa" w:w="140"/>
-              <w:bottom w:type="dxa" w:w="100"/>
-              <w:right w:type="dxa" w:w="140"/>
+              <w:top w:type="dxa" w:w="90"/>
+              <w:left w:type="dxa" w:w="130"/>
+              <w:bottom w:type="dxa" w:w="90"/>
+              <w:right w:type="dxa" w:w="130"/>
             </w:tcMar>
           </w:tcPr>
           <w:p>
@@ -2522,10 +2934,10 @@
             <w:tcW w:type="pct" w:w="26%"/>
             <w:shd w:fill="F8FAFC" w:val="clear"/>
             <w:tcMar>
-              <w:top w:type="dxa" w:w="100"/>
-              <w:left w:type="dxa" w:w="140"/>
-              <w:bottom w:type="dxa" w:w="100"/>
-              <w:right w:type="dxa" w:w="140"/>
+              <w:top w:type="dxa" w:w="90"/>
+              <w:left w:type="dxa" w:w="130"/>
+              <w:bottom w:type="dxa" w:w="90"/>
+              <w:right w:type="dxa" w:w="130"/>
             </w:tcMar>
           </w:tcPr>
           <w:p>
@@ -2549,10 +2961,10 @@
             <w:tcW w:type="pct" w:w="26%"/>
             <w:shd w:fill="F8FAFC" w:val="clear"/>
             <w:tcMar>
-              <w:top w:type="dxa" w:w="100"/>
-              <w:left w:type="dxa" w:w="140"/>
-              <w:bottom w:type="dxa" w:w="100"/>
-              <w:right w:type="dxa" w:w="140"/>
+              <w:top w:type="dxa" w:w="90"/>
+              <w:left w:type="dxa" w:w="130"/>
+              <w:bottom w:type="dxa" w:w="90"/>
+              <w:right w:type="dxa" w:w="130"/>
             </w:tcMar>
           </w:tcPr>
           <w:p>
@@ -2574,10 +2986,10 @@
             <w:tcW w:type="pct" w:w="48%"/>
             <w:shd w:fill="F8FAFC" w:val="clear"/>
             <w:tcMar>
-              <w:top w:type="dxa" w:w="100"/>
-              <w:left w:type="dxa" w:w="140"/>
-              <w:bottom w:type="dxa" w:w="100"/>
-              <w:right w:type="dxa" w:w="140"/>
+              <w:top w:type="dxa" w:w="90"/>
+              <w:left w:type="dxa" w:w="130"/>
+              <w:bottom w:type="dxa" w:w="90"/>
+              <w:right w:type="dxa" w:w="130"/>
             </w:tcMar>
           </w:tcPr>
           <w:p>
@@ -2599,10 +3011,10 @@
             <w:tcW w:type="pct" w:w="26%"/>
             <w:shd w:fill="F8FAFC" w:val="clear"/>
             <w:tcMar>
-              <w:top w:type="dxa" w:w="100"/>
-              <w:left w:type="dxa" w:w="140"/>
-              <w:bottom w:type="dxa" w:w="100"/>
-              <w:right w:type="dxa" w:w="140"/>
+              <w:top w:type="dxa" w:w="90"/>
+              <w:left w:type="dxa" w:w="130"/>
+              <w:bottom w:type="dxa" w:w="90"/>
+              <w:right w:type="dxa" w:w="130"/>
             </w:tcMar>
           </w:tcPr>
           <w:p>
@@ -2626,10 +3038,10 @@
             <w:tcW w:type="pct" w:w="26%"/>
             <w:shd w:fill="F8FAFC" w:val="clear"/>
             <w:tcMar>
-              <w:top w:type="dxa" w:w="100"/>
-              <w:left w:type="dxa" w:w="140"/>
-              <w:bottom w:type="dxa" w:w="100"/>
-              <w:right w:type="dxa" w:w="140"/>
+              <w:top w:type="dxa" w:w="90"/>
+              <w:left w:type="dxa" w:w="130"/>
+              <w:bottom w:type="dxa" w:w="90"/>
+              <w:right w:type="dxa" w:w="130"/>
             </w:tcMar>
           </w:tcPr>
           <w:p>
@@ -2651,10 +3063,10 @@
             <w:tcW w:type="pct" w:w="48%"/>
             <w:shd w:fill="F8FAFC" w:val="clear"/>
             <w:tcMar>
-              <w:top w:type="dxa" w:w="100"/>
-              <w:left w:type="dxa" w:w="140"/>
-              <w:bottom w:type="dxa" w:w="100"/>
-              <w:right w:type="dxa" w:w="140"/>
+              <w:top w:type="dxa" w:w="90"/>
+              <w:left w:type="dxa" w:w="130"/>
+              <w:bottom w:type="dxa" w:w="90"/>
+              <w:right w:type="dxa" w:w="130"/>
             </w:tcMar>
           </w:tcPr>
           <w:p>
@@ -2676,10 +3088,10 @@
             <w:tcW w:type="pct" w:w="26%"/>
             <w:shd w:fill="F8FAFC" w:val="clear"/>
             <w:tcMar>
-              <w:top w:type="dxa" w:w="100"/>
-              <w:left w:type="dxa" w:w="140"/>
-              <w:bottom w:type="dxa" w:w="100"/>
-              <w:right w:type="dxa" w:w="140"/>
+              <w:top w:type="dxa" w:w="90"/>
+              <w:left w:type="dxa" w:w="130"/>
+              <w:bottom w:type="dxa" w:w="90"/>
+              <w:right w:type="dxa" w:w="130"/>
             </w:tcMar>
           </w:tcPr>
           <w:p>
@@ -2703,10 +3115,10 @@
             <w:tcW w:type="pct" w:w="26%"/>
             <w:shd w:fill="F8FAFC" w:val="clear"/>
             <w:tcMar>
-              <w:top w:type="dxa" w:w="100"/>
-              <w:left w:type="dxa" w:w="140"/>
-              <w:bottom w:type="dxa" w:w="100"/>
-              <w:right w:type="dxa" w:w="140"/>
+              <w:top w:type="dxa" w:w="90"/>
+              <w:left w:type="dxa" w:w="130"/>
+              <w:bottom w:type="dxa" w:w="90"/>
+              <w:right w:type="dxa" w:w="130"/>
             </w:tcMar>
           </w:tcPr>
           <w:p>
@@ -2728,10 +3140,10 @@
             <w:tcW w:type="pct" w:w="48%"/>
             <w:shd w:fill="F8FAFC" w:val="clear"/>
             <w:tcMar>
-              <w:top w:type="dxa" w:w="100"/>
-              <w:left w:type="dxa" w:w="140"/>
-              <w:bottom w:type="dxa" w:w="100"/>
-              <w:right w:type="dxa" w:w="140"/>
+              <w:top w:type="dxa" w:w="90"/>
+              <w:left w:type="dxa" w:w="130"/>
+              <w:bottom w:type="dxa" w:w="90"/>
+              <w:right w:type="dxa" w:w="130"/>
             </w:tcMar>
           </w:tcPr>
           <w:p>
@@ -2753,10 +3165,10 @@
             <w:tcW w:type="pct" w:w="26%"/>
             <w:shd w:fill="F8FAFC" w:val="clear"/>
             <w:tcMar>
-              <w:top w:type="dxa" w:w="100"/>
-              <w:left w:type="dxa" w:w="140"/>
-              <w:bottom w:type="dxa" w:w="100"/>
-              <w:right w:type="dxa" w:w="140"/>
+              <w:top w:type="dxa" w:w="90"/>
+              <w:left w:type="dxa" w:w="130"/>
+              <w:bottom w:type="dxa" w:w="90"/>
+              <w:right w:type="dxa" w:w="130"/>
             </w:tcMar>
           </w:tcPr>
           <w:p>
@@ -2780,10 +3192,10 @@
             <w:tcW w:type="pct" w:w="26%"/>
             <w:shd w:fill="F8FAFC" w:val="clear"/>
             <w:tcMar>
-              <w:top w:type="dxa" w:w="100"/>
-              <w:left w:type="dxa" w:w="140"/>
-              <w:bottom w:type="dxa" w:w="100"/>
-              <w:right w:type="dxa" w:w="140"/>
+              <w:top w:type="dxa" w:w="90"/>
+              <w:left w:type="dxa" w:w="130"/>
+              <w:bottom w:type="dxa" w:w="90"/>
+              <w:right w:type="dxa" w:w="130"/>
             </w:tcMar>
           </w:tcPr>
           <w:p>
@@ -2805,10 +3217,10 @@
             <w:tcW w:type="pct" w:w="48%"/>
             <w:shd w:fill="F8FAFC" w:val="clear"/>
             <w:tcMar>
-              <w:top w:type="dxa" w:w="100"/>
-              <w:left w:type="dxa" w:w="140"/>
-              <w:bottom w:type="dxa" w:w="100"/>
-              <w:right w:type="dxa" w:w="140"/>
+              <w:top w:type="dxa" w:w="90"/>
+              <w:left w:type="dxa" w:w="130"/>
+              <w:bottom w:type="dxa" w:w="90"/>
+              <w:right w:type="dxa" w:w="130"/>
             </w:tcMar>
           </w:tcPr>
           <w:p>
@@ -2830,10 +3242,10 @@
             <w:tcW w:type="pct" w:w="26%"/>
             <w:shd w:fill="F8FAFC" w:val="clear"/>
             <w:tcMar>
-              <w:top w:type="dxa" w:w="100"/>
-              <w:left w:type="dxa" w:w="140"/>
-              <w:bottom w:type="dxa" w:w="100"/>
-              <w:right w:type="dxa" w:w="140"/>
+              <w:top w:type="dxa" w:w="90"/>
+              <w:left w:type="dxa" w:w="130"/>
+              <w:bottom w:type="dxa" w:w="90"/>
+              <w:right w:type="dxa" w:w="130"/>
             </w:tcMar>
           </w:tcPr>
           <w:p>
@@ -2857,10 +3269,10 @@
             <w:tcW w:type="pct" w:w="26%"/>
             <w:shd w:fill="F8FAFC" w:val="clear"/>
             <w:tcMar>
-              <w:top w:type="dxa" w:w="100"/>
-              <w:left w:type="dxa" w:w="140"/>
-              <w:bottom w:type="dxa" w:w="100"/>
-              <w:right w:type="dxa" w:w="140"/>
+              <w:top w:type="dxa" w:w="90"/>
+              <w:left w:type="dxa" w:w="130"/>
+              <w:bottom w:type="dxa" w:w="90"/>
+              <w:right w:type="dxa" w:w="130"/>
             </w:tcMar>
           </w:tcPr>
           <w:p>
@@ -2882,10 +3294,10 @@
             <w:tcW w:type="pct" w:w="48%"/>
             <w:shd w:fill="F8FAFC" w:val="clear"/>
             <w:tcMar>
-              <w:top w:type="dxa" w:w="100"/>
-              <w:left w:type="dxa" w:w="140"/>
-              <w:bottom w:type="dxa" w:w="100"/>
-              <w:right w:type="dxa" w:w="140"/>
+              <w:top w:type="dxa" w:w="90"/>
+              <w:left w:type="dxa" w:w="130"/>
+              <w:bottom w:type="dxa" w:w="90"/>
+              <w:right w:type="dxa" w:w="130"/>
             </w:tcMar>
           </w:tcPr>
           <w:p>
@@ -2907,10 +3319,10 @@
             <w:tcW w:type="pct" w:w="26%"/>
             <w:shd w:fill="F8FAFC" w:val="clear"/>
             <w:tcMar>
-              <w:top w:type="dxa" w:w="100"/>
-              <w:left w:type="dxa" w:w="140"/>
-              <w:bottom w:type="dxa" w:w="100"/>
-              <w:right w:type="dxa" w:w="140"/>
+              <w:top w:type="dxa" w:w="90"/>
+              <w:left w:type="dxa" w:w="130"/>
+              <w:bottom w:type="dxa" w:w="90"/>
+              <w:right w:type="dxa" w:w="130"/>
             </w:tcMar>
           </w:tcPr>
           <w:p>
@@ -2934,10 +3346,10 @@
             <w:tcW w:type="pct" w:w="26%"/>
             <w:shd w:fill="F8FAFC" w:val="clear"/>
             <w:tcMar>
-              <w:top w:type="dxa" w:w="100"/>
-              <w:left w:type="dxa" w:w="140"/>
-              <w:bottom w:type="dxa" w:w="100"/>
-              <w:right w:type="dxa" w:w="140"/>
+              <w:top w:type="dxa" w:w="90"/>
+              <w:left w:type="dxa" w:w="130"/>
+              <w:bottom w:type="dxa" w:w="90"/>
+              <w:right w:type="dxa" w:w="130"/>
             </w:tcMar>
           </w:tcPr>
           <w:p>
@@ -2959,10 +3371,10 @@
             <w:tcW w:type="pct" w:w="48%"/>
             <w:shd w:fill="F8FAFC" w:val="clear"/>
             <w:tcMar>
-              <w:top w:type="dxa" w:w="100"/>
-              <w:left w:type="dxa" w:w="140"/>
-              <w:bottom w:type="dxa" w:w="100"/>
-              <w:right w:type="dxa" w:w="140"/>
+              <w:top w:type="dxa" w:w="90"/>
+              <w:left w:type="dxa" w:w="130"/>
+              <w:bottom w:type="dxa" w:w="90"/>
+              <w:right w:type="dxa" w:w="130"/>
             </w:tcMar>
           </w:tcPr>
           <w:p>
@@ -2984,10 +3396,10 @@
             <w:tcW w:type="pct" w:w="26%"/>
             <w:shd w:fill="F8FAFC" w:val="clear"/>
             <w:tcMar>
-              <w:top w:type="dxa" w:w="100"/>
-              <w:left w:type="dxa" w:w="140"/>
-              <w:bottom w:type="dxa" w:w="100"/>
-              <w:right w:type="dxa" w:w="140"/>
+              <w:top w:type="dxa" w:w="90"/>
+              <w:left w:type="dxa" w:w="130"/>
+              <w:bottom w:type="dxa" w:w="90"/>
+              <w:right w:type="dxa" w:w="130"/>
             </w:tcMar>
           </w:tcPr>
           <w:p>
@@ -3009,7 +3421,7 @@
     <w:p>
       <w:pPr>
         <w:pStyle w:val="Heading1"/>
-        <w:spacing w:after="100" w:before="240"/>
+        <w:spacing w:after="80" w:before="200"/>
       </w:pPr>
       <w:r>
         <w:rPr>
@@ -3019,29 +3431,7 @@
           <w:sz w:val="24"/>
           <w:szCs w:val="24"/>
         </w:rPr>
-        <w:t xml:space="preserve">9. Empirical Usability Evaluation &amp; Experimental Results</w:t>
-      </w:r>
-    </w:p>
-    <w:p>
-      <w:pPr>
-        <w:spacing w:after="80" w:before="80"/>
-      </w:pPr>
-      <w:r>
-        <w:rPr>
-          <w:sz w:val="20"/>
-          <w:szCs w:val="20"/>
-        </w:rPr>
-        <w:t xml:space="preserve">A formal within-subjects usability evaluation was conducted with N = 12 participants (4 university lecturers, 4 corporate project managers, and 4 software engineering students; 7 male, 5 female; aged 21–46, mean = 27.4 years). Each participant completed three realistic presentation scenarios: (1) Standard 10-slide academic lecture walkthrough, (2) Fast-paced interactive Q&amp;A slide navigation, and (3) Continuous laser spotlight demonstration. Telemetry data was recorded across 850 total gestures.
-</w:t>
-      </w:r>
-      <w:r>
-        <w:rPr>
-          <w:b/>
-          <w:bCs/>
-          <w:sz w:val="19"/>
-          <w:szCs w:val="19"/>
-        </w:rPr>
-        <w:t xml:space="preserve">Table 3: Quantitative Usability Benchmarks &amp; Performance Metrics</w:t>
+        <w:t xml:space="preserve">10. Empirical Usability Evaluation &amp; Benchmark Results</w:t>
       </w:r>
     </w:p>
     <w:tbl>
@@ -3068,10 +3458,10 @@
             <w:tcW w:type="pct" w:w="32%"/>
             <w:shd w:fill="1E3A8A" w:val="clear"/>
             <w:tcMar>
-              <w:top w:type="dxa" w:w="100"/>
-              <w:left w:type="dxa" w:w="140"/>
-              <w:bottom w:type="dxa" w:w="100"/>
-              <w:right w:type="dxa" w:w="140"/>
+              <w:top w:type="dxa" w:w="90"/>
+              <w:left w:type="dxa" w:w="130"/>
+              <w:bottom w:type="dxa" w:w="90"/>
+              <w:right w:type="dxa" w:w="130"/>
             </w:tcMar>
           </w:tcPr>
           <w:p>
@@ -3093,10 +3483,10 @@
             <w:tcW w:type="pct" w:w="26%"/>
             <w:shd w:fill="1E3A8A" w:val="clear"/>
             <w:tcMar>
-              <w:top w:type="dxa" w:w="100"/>
-              <w:left w:type="dxa" w:w="140"/>
-              <w:bottom w:type="dxa" w:w="100"/>
-              <w:right w:type="dxa" w:w="140"/>
+              <w:top w:type="dxa" w:w="90"/>
+              <w:left w:type="dxa" w:w="130"/>
+              <w:bottom w:type="dxa" w:w="90"/>
+              <w:right w:type="dxa" w:w="130"/>
             </w:tcMar>
           </w:tcPr>
           <w:p>
@@ -3118,10 +3508,10 @@
             <w:tcW w:type="pct" w:w="22%"/>
             <w:shd w:fill="1E3A8A" w:val="clear"/>
             <w:tcMar>
-              <w:top w:type="dxa" w:w="100"/>
-              <w:left w:type="dxa" w:w="140"/>
-              <w:bottom w:type="dxa" w:w="100"/>
-              <w:right w:type="dxa" w:w="140"/>
+              <w:top w:type="dxa" w:w="90"/>
+              <w:left w:type="dxa" w:w="130"/>
+              <w:bottom w:type="dxa" w:w="90"/>
+              <w:right w:type="dxa" w:w="130"/>
             </w:tcMar>
           </w:tcPr>
           <w:p>
@@ -3143,10 +3533,10 @@
             <w:tcW w:type="pct" w:w="20%"/>
             <w:shd w:fill="1E3A8A" w:val="clear"/>
             <w:tcMar>
-              <w:top w:type="dxa" w:w="100"/>
-              <w:left w:type="dxa" w:w="140"/>
-              <w:bottom w:type="dxa" w:w="100"/>
-              <w:right w:type="dxa" w:w="140"/>
+              <w:top w:type="dxa" w:w="90"/>
+              <w:left w:type="dxa" w:w="130"/>
+              <w:bottom w:type="dxa" w:w="90"/>
+              <w:right w:type="dxa" w:w="130"/>
             </w:tcMar>
           </w:tcPr>
           <w:p>
@@ -3170,10 +3560,10 @@
             <w:tcW w:type="pct" w:w="32%"/>
             <w:shd w:fill="F8FAFC" w:val="clear"/>
             <w:tcMar>
-              <w:top w:type="dxa" w:w="100"/>
-              <w:left w:type="dxa" w:w="140"/>
-              <w:bottom w:type="dxa" w:w="100"/>
-              <w:right w:type="dxa" w:w="140"/>
+              <w:top w:type="dxa" w:w="90"/>
+              <w:left w:type="dxa" w:w="130"/>
+              <w:bottom w:type="dxa" w:w="90"/>
+              <w:right w:type="dxa" w:w="130"/>
             </w:tcMar>
           </w:tcPr>
           <w:p>
@@ -3195,10 +3585,10 @@
             <w:tcW w:type="pct" w:w="26%"/>
             <w:shd w:fill="F8FAFC" w:val="clear"/>
             <w:tcMar>
-              <w:top w:type="dxa" w:w="100"/>
-              <w:left w:type="dxa" w:w="140"/>
-              <w:bottom w:type="dxa" w:w="100"/>
-              <w:right w:type="dxa" w:w="140"/>
+              <w:top w:type="dxa" w:w="90"/>
+              <w:left w:type="dxa" w:w="130"/>
+              <w:bottom w:type="dxa" w:w="90"/>
+              <w:right w:type="dxa" w:w="130"/>
             </w:tcMar>
           </w:tcPr>
           <w:p>
@@ -3220,10 +3610,10 @@
             <w:tcW w:type="pct" w:w="22%"/>
             <w:shd w:fill="F8FAFC" w:val="clear"/>
             <w:tcMar>
-              <w:top w:type="dxa" w:w="100"/>
-              <w:left w:type="dxa" w:w="140"/>
-              <w:bottom w:type="dxa" w:w="100"/>
-              <w:right w:type="dxa" w:w="140"/>
+              <w:top w:type="dxa" w:w="90"/>
+              <w:left w:type="dxa" w:w="130"/>
+              <w:bottom w:type="dxa" w:w="90"/>
+              <w:right w:type="dxa" w:w="130"/>
             </w:tcMar>
           </w:tcPr>
           <w:p>
@@ -3245,10 +3635,10 @@
             <w:tcW w:type="pct" w:w="20%"/>
             <w:shd w:fill="F8FAFC" w:val="clear"/>
             <w:tcMar>
-              <w:top w:type="dxa" w:w="100"/>
-              <w:left w:type="dxa" w:w="140"/>
-              <w:bottom w:type="dxa" w:w="100"/>
-              <w:right w:type="dxa" w:w="140"/>
+              <w:top w:type="dxa" w:w="90"/>
+              <w:left w:type="dxa" w:w="130"/>
+              <w:bottom w:type="dxa" w:w="90"/>
+              <w:right w:type="dxa" w:w="130"/>
             </w:tcMar>
           </w:tcPr>
           <w:p>
@@ -3272,10 +3662,10 @@
             <w:tcW w:type="pct" w:w="32%"/>
             <w:shd w:fill="F8FAFC" w:val="clear"/>
             <w:tcMar>
-              <w:top w:type="dxa" w:w="100"/>
-              <w:left w:type="dxa" w:w="140"/>
-              <w:bottom w:type="dxa" w:w="100"/>
-              <w:right w:type="dxa" w:w="140"/>
+              <w:top w:type="dxa" w:w="90"/>
+              <w:left w:type="dxa" w:w="130"/>
+              <w:bottom w:type="dxa" w:w="90"/>
+              <w:right w:type="dxa" w:w="130"/>
             </w:tcMar>
           </w:tcPr>
           <w:p>
@@ -3297,10 +3687,10 @@
             <w:tcW w:type="pct" w:w="26%"/>
             <w:shd w:fill="F8FAFC" w:val="clear"/>
             <w:tcMar>
-              <w:top w:type="dxa" w:w="100"/>
-              <w:left w:type="dxa" w:w="140"/>
-              <w:bottom w:type="dxa" w:w="100"/>
-              <w:right w:type="dxa" w:w="140"/>
+              <w:top w:type="dxa" w:w="90"/>
+              <w:left w:type="dxa" w:w="130"/>
+              <w:bottom w:type="dxa" w:w="90"/>
+              <w:right w:type="dxa" w:w="130"/>
             </w:tcMar>
           </w:tcPr>
           <w:p>
@@ -3322,10 +3712,10 @@
             <w:tcW w:type="pct" w:w="22%"/>
             <w:shd w:fill="F8FAFC" w:val="clear"/>
             <w:tcMar>
-              <w:top w:type="dxa" w:w="100"/>
-              <w:left w:type="dxa" w:w="140"/>
-              <w:bottom w:type="dxa" w:w="100"/>
-              <w:right w:type="dxa" w:w="140"/>
+              <w:top w:type="dxa" w:w="90"/>
+              <w:left w:type="dxa" w:w="130"/>
+              <w:bottom w:type="dxa" w:w="90"/>
+              <w:right w:type="dxa" w:w="130"/>
             </w:tcMar>
           </w:tcPr>
           <w:p>
@@ -3347,10 +3737,10 @@
             <w:tcW w:type="pct" w:w="20%"/>
             <w:shd w:fill="F8FAFC" w:val="clear"/>
             <w:tcMar>
-              <w:top w:type="dxa" w:w="100"/>
-              <w:left w:type="dxa" w:w="140"/>
-              <w:bottom w:type="dxa" w:w="100"/>
-              <w:right w:type="dxa" w:w="140"/>
+              <w:top w:type="dxa" w:w="90"/>
+              <w:left w:type="dxa" w:w="130"/>
+              <w:bottom w:type="dxa" w:w="90"/>
+              <w:right w:type="dxa" w:w="130"/>
             </w:tcMar>
           </w:tcPr>
           <w:p>
@@ -3374,10 +3764,10 @@
             <w:tcW w:type="pct" w:w="32%"/>
             <w:shd w:fill="F8FAFC" w:val="clear"/>
             <w:tcMar>
-              <w:top w:type="dxa" w:w="100"/>
-              <w:left w:type="dxa" w:w="140"/>
-              <w:bottom w:type="dxa" w:w="100"/>
-              <w:right w:type="dxa" w:w="140"/>
+              <w:top w:type="dxa" w:w="90"/>
+              <w:left w:type="dxa" w:w="130"/>
+              <w:bottom w:type="dxa" w:w="90"/>
+              <w:right w:type="dxa" w:w="130"/>
             </w:tcMar>
           </w:tcPr>
           <w:p>
@@ -3399,10 +3789,10 @@
             <w:tcW w:type="pct" w:w="26%"/>
             <w:shd w:fill="F8FAFC" w:val="clear"/>
             <w:tcMar>
-              <w:top w:type="dxa" w:w="100"/>
-              <w:left w:type="dxa" w:w="140"/>
-              <w:bottom w:type="dxa" w:w="100"/>
-              <w:right w:type="dxa" w:w="140"/>
+              <w:top w:type="dxa" w:w="90"/>
+              <w:left w:type="dxa" w:w="130"/>
+              <w:bottom w:type="dxa" w:w="90"/>
+              <w:right w:type="dxa" w:w="130"/>
             </w:tcMar>
           </w:tcPr>
           <w:p>
@@ -3424,10 +3814,10 @@
             <w:tcW w:type="pct" w:w="22%"/>
             <w:shd w:fill="F8FAFC" w:val="clear"/>
             <w:tcMar>
-              <w:top w:type="dxa" w:w="100"/>
-              <w:left w:type="dxa" w:w="140"/>
-              <w:bottom w:type="dxa" w:w="100"/>
-              <w:right w:type="dxa" w:w="140"/>
+              <w:top w:type="dxa" w:w="90"/>
+              <w:left w:type="dxa" w:w="130"/>
+              <w:bottom w:type="dxa" w:w="90"/>
+              <w:right w:type="dxa" w:w="130"/>
             </w:tcMar>
           </w:tcPr>
           <w:p>
@@ -3449,10 +3839,10 @@
             <w:tcW w:type="pct" w:w="20%"/>
             <w:shd w:fill="F8FAFC" w:val="clear"/>
             <w:tcMar>
-              <w:top w:type="dxa" w:w="100"/>
-              <w:left w:type="dxa" w:w="140"/>
-              <w:bottom w:type="dxa" w:w="100"/>
-              <w:right w:type="dxa" w:w="140"/>
+              <w:top w:type="dxa" w:w="90"/>
+              <w:left w:type="dxa" w:w="130"/>
+              <w:bottom w:type="dxa" w:w="90"/>
+              <w:right w:type="dxa" w:w="130"/>
             </w:tcMar>
           </w:tcPr>
           <w:p>
@@ -3476,10 +3866,10 @@
             <w:tcW w:type="pct" w:w="32%"/>
             <w:shd w:fill="F8FAFC" w:val="clear"/>
             <w:tcMar>
-              <w:top w:type="dxa" w:w="100"/>
-              <w:left w:type="dxa" w:w="140"/>
-              <w:bottom w:type="dxa" w:w="100"/>
-              <w:right w:type="dxa" w:w="140"/>
+              <w:top w:type="dxa" w:w="90"/>
+              <w:left w:type="dxa" w:w="130"/>
+              <w:bottom w:type="dxa" w:w="90"/>
+              <w:right w:type="dxa" w:w="130"/>
             </w:tcMar>
           </w:tcPr>
           <w:p>
@@ -3501,10 +3891,10 @@
             <w:tcW w:type="pct" w:w="26%"/>
             <w:shd w:fill="F8FAFC" w:val="clear"/>
             <w:tcMar>
-              <w:top w:type="dxa" w:w="100"/>
-              <w:left w:type="dxa" w:w="140"/>
-              <w:bottom w:type="dxa" w:w="100"/>
-              <w:right w:type="dxa" w:w="140"/>
+              <w:top w:type="dxa" w:w="90"/>
+              <w:left w:type="dxa" w:w="130"/>
+              <w:bottom w:type="dxa" w:w="90"/>
+              <w:right w:type="dxa" w:w="130"/>
             </w:tcMar>
           </w:tcPr>
           <w:p>
@@ -3526,10 +3916,10 @@
             <w:tcW w:type="pct" w:w="22%"/>
             <w:shd w:fill="F8FAFC" w:val="clear"/>
             <w:tcMar>
-              <w:top w:type="dxa" w:w="100"/>
-              <w:left w:type="dxa" w:w="140"/>
-              <w:bottom w:type="dxa" w:w="100"/>
-              <w:right w:type="dxa" w:w="140"/>
+              <w:top w:type="dxa" w:w="90"/>
+              <w:left w:type="dxa" w:w="130"/>
+              <w:bottom w:type="dxa" w:w="90"/>
+              <w:right w:type="dxa" w:w="130"/>
             </w:tcMar>
           </w:tcPr>
           <w:p>
@@ -3551,10 +3941,10 @@
             <w:tcW w:type="pct" w:w="20%"/>
             <w:shd w:fill="F8FAFC" w:val="clear"/>
             <w:tcMar>
-              <w:top w:type="dxa" w:w="100"/>
-              <w:left w:type="dxa" w:w="140"/>
-              <w:bottom w:type="dxa" w:w="100"/>
-              <w:right w:type="dxa" w:w="140"/>
+              <w:top w:type="dxa" w:w="90"/>
+              <w:left w:type="dxa" w:w="130"/>
+              <w:bottom w:type="dxa" w:w="90"/>
+              <w:right w:type="dxa" w:w="130"/>
             </w:tcMar>
           </w:tcPr>
           <w:p>
@@ -3578,10 +3968,10 @@
             <w:tcW w:type="pct" w:w="32%"/>
             <w:shd w:fill="F8FAFC" w:val="clear"/>
             <w:tcMar>
-              <w:top w:type="dxa" w:w="100"/>
-              <w:left w:type="dxa" w:w="140"/>
-              <w:bottom w:type="dxa" w:w="100"/>
-              <w:right w:type="dxa" w:w="140"/>
+              <w:top w:type="dxa" w:w="90"/>
+              <w:left w:type="dxa" w:w="130"/>
+              <w:bottom w:type="dxa" w:w="90"/>
+              <w:right w:type="dxa" w:w="130"/>
             </w:tcMar>
           </w:tcPr>
           <w:p>
@@ -3603,10 +3993,10 @@
             <w:tcW w:type="pct" w:w="26%"/>
             <w:shd w:fill="F8FAFC" w:val="clear"/>
             <w:tcMar>
-              <w:top w:type="dxa" w:w="100"/>
-              <w:left w:type="dxa" w:w="140"/>
-              <w:bottom w:type="dxa" w:w="100"/>
-              <w:right w:type="dxa" w:w="140"/>
+              <w:top w:type="dxa" w:w="90"/>
+              <w:left w:type="dxa" w:w="130"/>
+              <w:bottom w:type="dxa" w:w="90"/>
+              <w:right w:type="dxa" w:w="130"/>
             </w:tcMar>
           </w:tcPr>
           <w:p>
@@ -3628,10 +4018,10 @@
             <w:tcW w:type="pct" w:w="22%"/>
             <w:shd w:fill="F8FAFC" w:val="clear"/>
             <w:tcMar>
-              <w:top w:type="dxa" w:w="100"/>
-              <w:left w:type="dxa" w:w="140"/>
-              <w:bottom w:type="dxa" w:w="100"/>
-              <w:right w:type="dxa" w:w="140"/>
+              <w:top w:type="dxa" w:w="90"/>
+              <w:left w:type="dxa" w:w="130"/>
+              <w:bottom w:type="dxa" w:w="90"/>
+              <w:right w:type="dxa" w:w="130"/>
             </w:tcMar>
           </w:tcPr>
           <w:p>
@@ -3653,10 +4043,10 @@
             <w:tcW w:type="pct" w:w="20%"/>
             <w:shd w:fill="F8FAFC" w:val="clear"/>
             <w:tcMar>
-              <w:top w:type="dxa" w:w="100"/>
-              <w:left w:type="dxa" w:w="140"/>
-              <w:bottom w:type="dxa" w:w="100"/>
-              <w:right w:type="dxa" w:w="140"/>
+              <w:top w:type="dxa" w:w="90"/>
+              <w:left w:type="dxa" w:w="130"/>
+              <w:bottom w:type="dxa" w:w="90"/>
+              <w:right w:type="dxa" w:w="130"/>
             </w:tcMar>
           </w:tcPr>
           <w:p>
@@ -3680,10 +4070,10 @@
             <w:tcW w:type="pct" w:w="32%"/>
             <w:shd w:fill="F8FAFC" w:val="clear"/>
             <w:tcMar>
-              <w:top w:type="dxa" w:w="100"/>
-              <w:left w:type="dxa" w:w="140"/>
-              <w:bottom w:type="dxa" w:w="100"/>
-              <w:right w:type="dxa" w:w="140"/>
+              <w:top w:type="dxa" w:w="90"/>
+              <w:left w:type="dxa" w:w="130"/>
+              <w:bottom w:type="dxa" w:w="90"/>
+              <w:right w:type="dxa" w:w="130"/>
             </w:tcMar>
           </w:tcPr>
           <w:p>
@@ -3705,10 +4095,10 @@
             <w:tcW w:type="pct" w:w="26%"/>
             <w:shd w:fill="F8FAFC" w:val="clear"/>
             <w:tcMar>
-              <w:top w:type="dxa" w:w="100"/>
-              <w:left w:type="dxa" w:w="140"/>
-              <w:bottom w:type="dxa" w:w="100"/>
-              <w:right w:type="dxa" w:w="140"/>
+              <w:top w:type="dxa" w:w="90"/>
+              <w:left w:type="dxa" w:w="130"/>
+              <w:bottom w:type="dxa" w:w="90"/>
+              <w:right w:type="dxa" w:w="130"/>
             </w:tcMar>
           </w:tcPr>
           <w:p>
@@ -3730,10 +4120,10 @@
             <w:tcW w:type="pct" w:w="22%"/>
             <w:shd w:fill="F8FAFC" w:val="clear"/>
             <w:tcMar>
-              <w:top w:type="dxa" w:w="100"/>
-              <w:left w:type="dxa" w:w="140"/>
-              <w:bottom w:type="dxa" w:w="100"/>
-              <w:right w:type="dxa" w:w="140"/>
+              <w:top w:type="dxa" w:w="90"/>
+              <w:left w:type="dxa" w:w="130"/>
+              <w:bottom w:type="dxa" w:w="90"/>
+              <w:right w:type="dxa" w:w="130"/>
             </w:tcMar>
           </w:tcPr>
           <w:p>
@@ -3755,10 +4145,10 @@
             <w:tcW w:type="pct" w:w="20%"/>
             <w:shd w:fill="F8FAFC" w:val="clear"/>
             <w:tcMar>
-              <w:top w:type="dxa" w:w="100"/>
-              <w:left w:type="dxa" w:w="140"/>
-              <w:bottom w:type="dxa" w:w="100"/>
-              <w:right w:type="dxa" w:w="140"/>
+              <w:top w:type="dxa" w:w="90"/>
+              <w:left w:type="dxa" w:w="130"/>
+              <w:bottom w:type="dxa" w:w="90"/>
+              <w:right w:type="dxa" w:w="130"/>
             </w:tcMar>
           </w:tcPr>
           <w:p>
@@ -3782,10 +4172,10 @@
             <w:tcW w:type="pct" w:w="32%"/>
             <w:shd w:fill="F8FAFC" w:val="clear"/>
             <w:tcMar>
-              <w:top w:type="dxa" w:w="100"/>
-              <w:left w:type="dxa" w:w="140"/>
-              <w:bottom w:type="dxa" w:w="100"/>
-              <w:right w:type="dxa" w:w="140"/>
+              <w:top w:type="dxa" w:w="90"/>
+              <w:left w:type="dxa" w:w="130"/>
+              <w:bottom w:type="dxa" w:w="90"/>
+              <w:right w:type="dxa" w:w="130"/>
             </w:tcMar>
           </w:tcPr>
           <w:p>
@@ -3807,10 +4197,10 @@
             <w:tcW w:type="pct" w:w="26%"/>
             <w:shd w:fill="F8FAFC" w:val="clear"/>
             <w:tcMar>
-              <w:top w:type="dxa" w:w="100"/>
-              <w:left w:type="dxa" w:w="140"/>
-              <w:bottom w:type="dxa" w:w="100"/>
-              <w:right w:type="dxa" w:w="140"/>
+              <w:top w:type="dxa" w:w="90"/>
+              <w:left w:type="dxa" w:w="130"/>
+              <w:bottom w:type="dxa" w:w="90"/>
+              <w:right w:type="dxa" w:w="130"/>
             </w:tcMar>
           </w:tcPr>
           <w:p>
@@ -3832,10 +4222,10 @@
             <w:tcW w:type="pct" w:w="22%"/>
             <w:shd w:fill="F8FAFC" w:val="clear"/>
             <w:tcMar>
-              <w:top w:type="dxa" w:w="100"/>
-              <w:left w:type="dxa" w:w="140"/>
-              <w:bottom w:type="dxa" w:w="100"/>
-              <w:right w:type="dxa" w:w="140"/>
+              <w:top w:type="dxa" w:w="90"/>
+              <w:left w:type="dxa" w:w="130"/>
+              <w:bottom w:type="dxa" w:w="90"/>
+              <w:right w:type="dxa" w:w="130"/>
             </w:tcMar>
           </w:tcPr>
           <w:p>
@@ -3857,10 +4247,10 @@
             <w:tcW w:type="pct" w:w="20%"/>
             <w:shd w:fill="F8FAFC" w:val="clear"/>
             <w:tcMar>
-              <w:top w:type="dxa" w:w="100"/>
-              <w:left w:type="dxa" w:w="140"/>
-              <w:bottom w:type="dxa" w:w="100"/>
-              <w:right w:type="dxa" w:w="140"/>
+              <w:top w:type="dxa" w:w="90"/>
+              <w:left w:type="dxa" w:w="130"/>
+              <w:bottom w:type="dxa" w:w="90"/>
+              <w:right w:type="dxa" w:w="130"/>
             </w:tcMar>
           </w:tcPr>
           <w:p>
@@ -3881,7 +4271,7 @@
     </w:tbl>
     <w:p>
       <w:pPr>
-        <w:spacing w:after="80" w:before="140"/>
+        <w:spacing w:after="70" w:before="120"/>
       </w:pPr>
       <w:r>
         <w:rPr>
@@ -3890,7 +4280,7 @@
           <w:sz w:val="19"/>
           <w:szCs w:val="19"/>
         </w:rPr>
-        <w:t xml:space="preserve">Table 4: System Usability Scale (SUS) 10-Item Breakdown</w:t>
+        <w:t xml:space="preserve">Table 5: System Usability Scale (SUS) 10-Item Breakdown</w:t>
       </w:r>
     </w:p>
     <w:tbl>
@@ -3916,10 +4306,10 @@
             <w:tcW w:type="pct" w:w="50%"/>
             <w:shd w:fill="1E3A8A" w:val="clear"/>
             <w:tcMar>
-              <w:top w:type="dxa" w:w="100"/>
-              <w:left w:type="dxa" w:w="140"/>
-              <w:bottom w:type="dxa" w:w="100"/>
-              <w:right w:type="dxa" w:w="140"/>
+              <w:top w:type="dxa" w:w="90"/>
+              <w:left w:type="dxa" w:w="130"/>
+              <w:bottom w:type="dxa" w:w="90"/>
+              <w:right w:type="dxa" w:w="130"/>
             </w:tcMar>
           </w:tcPr>
           <w:p>
@@ -3941,10 +4331,10 @@
             <w:tcW w:type="pct" w:w="24%"/>
             <w:shd w:fill="1E3A8A" w:val="clear"/>
             <w:tcMar>
-              <w:top w:type="dxa" w:w="100"/>
-              <w:left w:type="dxa" w:w="140"/>
-              <w:bottom w:type="dxa" w:w="100"/>
-              <w:right w:type="dxa" w:w="140"/>
+              <w:top w:type="dxa" w:w="90"/>
+              <w:left w:type="dxa" w:w="130"/>
+              <w:bottom w:type="dxa" w:w="90"/>
+              <w:right w:type="dxa" w:w="130"/>
             </w:tcMar>
           </w:tcPr>
           <w:p>
@@ -3966,10 +4356,10 @@
             <w:tcW w:type="pct" w:w="26%"/>
             <w:shd w:fill="1E3A8A" w:val="clear"/>
             <w:tcMar>
-              <w:top w:type="dxa" w:w="100"/>
-              <w:left w:type="dxa" w:w="140"/>
-              <w:bottom w:type="dxa" w:w="100"/>
-              <w:right w:type="dxa" w:w="140"/>
+              <w:top w:type="dxa" w:w="90"/>
+              <w:left w:type="dxa" w:w="130"/>
+              <w:bottom w:type="dxa" w:w="90"/>
+              <w:right w:type="dxa" w:w="130"/>
             </w:tcMar>
           </w:tcPr>
           <w:p>
@@ -3993,10 +4383,10 @@
             <w:tcW w:type="pct" w:w="50%"/>
             <w:shd w:fill="F8FAFC" w:val="clear"/>
             <w:tcMar>
-              <w:top w:type="dxa" w:w="100"/>
-              <w:left w:type="dxa" w:w="140"/>
-              <w:bottom w:type="dxa" w:w="100"/>
-              <w:right w:type="dxa" w:w="140"/>
+              <w:top w:type="dxa" w:w="90"/>
+              <w:left w:type="dxa" w:w="130"/>
+              <w:bottom w:type="dxa" w:w="90"/>
+              <w:right w:type="dxa" w:w="130"/>
             </w:tcMar>
           </w:tcPr>
           <w:p>
@@ -4018,10 +4408,10 @@
             <w:tcW w:type="pct" w:w="24%"/>
             <w:shd w:fill="F8FAFC" w:val="clear"/>
             <w:tcMar>
-              <w:top w:type="dxa" w:w="100"/>
-              <w:left w:type="dxa" w:w="140"/>
-              <w:bottom w:type="dxa" w:w="100"/>
-              <w:right w:type="dxa" w:w="140"/>
+              <w:top w:type="dxa" w:w="90"/>
+              <w:left w:type="dxa" w:w="130"/>
+              <w:bottom w:type="dxa" w:w="90"/>
+              <w:right w:type="dxa" w:w="130"/>
             </w:tcMar>
           </w:tcPr>
           <w:p>
@@ -4043,10 +4433,10 @@
             <w:tcW w:type="pct" w:w="26%"/>
             <w:shd w:fill="F8FAFC" w:val="clear"/>
             <w:tcMar>
-              <w:top w:type="dxa" w:w="100"/>
-              <w:left w:type="dxa" w:w="140"/>
-              <w:bottom w:type="dxa" w:w="100"/>
-              <w:right w:type="dxa" w:w="140"/>
+              <w:top w:type="dxa" w:w="90"/>
+              <w:left w:type="dxa" w:w="130"/>
+              <w:bottom w:type="dxa" w:w="90"/>
+              <w:right w:type="dxa" w:w="130"/>
             </w:tcMar>
           </w:tcPr>
           <w:p>
@@ -4070,10 +4460,10 @@
             <w:tcW w:type="pct" w:w="50%"/>
             <w:shd w:fill="F8FAFC" w:val="clear"/>
             <w:tcMar>
-              <w:top w:type="dxa" w:w="100"/>
-              <w:left w:type="dxa" w:w="140"/>
-              <w:bottom w:type="dxa" w:w="100"/>
-              <w:right w:type="dxa" w:w="140"/>
+              <w:top w:type="dxa" w:w="90"/>
+              <w:left w:type="dxa" w:w="130"/>
+              <w:bottom w:type="dxa" w:w="90"/>
+              <w:right w:type="dxa" w:w="130"/>
             </w:tcMar>
           </w:tcPr>
           <w:p>
@@ -4095,10 +4485,10 @@
             <w:tcW w:type="pct" w:w="24%"/>
             <w:shd w:fill="F8FAFC" w:val="clear"/>
             <w:tcMar>
-              <w:top w:type="dxa" w:w="100"/>
-              <w:left w:type="dxa" w:w="140"/>
-              <w:bottom w:type="dxa" w:w="100"/>
-              <w:right w:type="dxa" w:w="140"/>
+              <w:top w:type="dxa" w:w="90"/>
+              <w:left w:type="dxa" w:w="130"/>
+              <w:bottom w:type="dxa" w:w="90"/>
+              <w:right w:type="dxa" w:w="130"/>
             </w:tcMar>
           </w:tcPr>
           <w:p>
@@ -4120,10 +4510,10 @@
             <w:tcW w:type="pct" w:w="26%"/>
             <w:shd w:fill="F8FAFC" w:val="clear"/>
             <w:tcMar>
-              <w:top w:type="dxa" w:w="100"/>
-              <w:left w:type="dxa" w:w="140"/>
-              <w:bottom w:type="dxa" w:w="100"/>
-              <w:right w:type="dxa" w:w="140"/>
+              <w:top w:type="dxa" w:w="90"/>
+              <w:left w:type="dxa" w:w="130"/>
+              <w:bottom w:type="dxa" w:w="90"/>
+              <w:right w:type="dxa" w:w="130"/>
             </w:tcMar>
           </w:tcPr>
           <w:p>
@@ -4147,10 +4537,10 @@
             <w:tcW w:type="pct" w:w="50%"/>
             <w:shd w:fill="F8FAFC" w:val="clear"/>
             <w:tcMar>
-              <w:top w:type="dxa" w:w="100"/>
-              <w:left w:type="dxa" w:w="140"/>
-              <w:bottom w:type="dxa" w:w="100"/>
-              <w:right w:type="dxa" w:w="140"/>
+              <w:top w:type="dxa" w:w="90"/>
+              <w:left w:type="dxa" w:w="130"/>
+              <w:bottom w:type="dxa" w:w="90"/>
+              <w:right w:type="dxa" w:w="130"/>
             </w:tcMar>
           </w:tcPr>
           <w:p>
@@ -4172,10 +4562,10 @@
             <w:tcW w:type="pct" w:w="24%"/>
             <w:shd w:fill="F8FAFC" w:val="clear"/>
             <w:tcMar>
-              <w:top w:type="dxa" w:w="100"/>
-              <w:left w:type="dxa" w:w="140"/>
-              <w:bottom w:type="dxa" w:w="100"/>
-              <w:right w:type="dxa" w:w="140"/>
+              <w:top w:type="dxa" w:w="90"/>
+              <w:left w:type="dxa" w:w="130"/>
+              <w:bottom w:type="dxa" w:w="90"/>
+              <w:right w:type="dxa" w:w="130"/>
             </w:tcMar>
           </w:tcPr>
           <w:p>
@@ -4197,10 +4587,10 @@
             <w:tcW w:type="pct" w:w="26%"/>
             <w:shd w:fill="F8FAFC" w:val="clear"/>
             <w:tcMar>
-              <w:top w:type="dxa" w:w="100"/>
-              <w:left w:type="dxa" w:w="140"/>
-              <w:bottom w:type="dxa" w:w="100"/>
-              <w:right w:type="dxa" w:w="140"/>
+              <w:top w:type="dxa" w:w="90"/>
+              <w:left w:type="dxa" w:w="130"/>
+              <w:bottom w:type="dxa" w:w="90"/>
+              <w:right w:type="dxa" w:w="130"/>
             </w:tcMar>
           </w:tcPr>
           <w:p>
@@ -4224,10 +4614,10 @@
             <w:tcW w:type="pct" w:w="50%"/>
             <w:shd w:fill="F8FAFC" w:val="clear"/>
             <w:tcMar>
-              <w:top w:type="dxa" w:w="100"/>
-              <w:left w:type="dxa" w:w="140"/>
-              <w:bottom w:type="dxa" w:w="100"/>
-              <w:right w:type="dxa" w:w="140"/>
+              <w:top w:type="dxa" w:w="90"/>
+              <w:left w:type="dxa" w:w="130"/>
+              <w:bottom w:type="dxa" w:w="90"/>
+              <w:right w:type="dxa" w:w="130"/>
             </w:tcMar>
           </w:tcPr>
           <w:p>
@@ -4249,10 +4639,10 @@
             <w:tcW w:type="pct" w:w="24%"/>
             <w:shd w:fill="F8FAFC" w:val="clear"/>
             <w:tcMar>
-              <w:top w:type="dxa" w:w="100"/>
-              <w:left w:type="dxa" w:w="140"/>
-              <w:bottom w:type="dxa" w:w="100"/>
-              <w:right w:type="dxa" w:w="140"/>
+              <w:top w:type="dxa" w:w="90"/>
+              <w:left w:type="dxa" w:w="130"/>
+              <w:bottom w:type="dxa" w:w="90"/>
+              <w:right w:type="dxa" w:w="130"/>
             </w:tcMar>
           </w:tcPr>
           <w:p>
@@ -4274,10 +4664,10 @@
             <w:tcW w:type="pct" w:w="26%"/>
             <w:shd w:fill="F8FAFC" w:val="clear"/>
             <w:tcMar>
-              <w:top w:type="dxa" w:w="100"/>
-              <w:left w:type="dxa" w:w="140"/>
-              <w:bottom w:type="dxa" w:w="100"/>
-              <w:right w:type="dxa" w:w="140"/>
+              <w:top w:type="dxa" w:w="90"/>
+              <w:left w:type="dxa" w:w="130"/>
+              <w:bottom w:type="dxa" w:w="90"/>
+              <w:right w:type="dxa" w:w="130"/>
             </w:tcMar>
           </w:tcPr>
           <w:p>
@@ -4301,10 +4691,10 @@
             <w:tcW w:type="pct" w:w="50%"/>
             <w:shd w:fill="F8FAFC" w:val="clear"/>
             <w:tcMar>
-              <w:top w:type="dxa" w:w="100"/>
-              <w:left w:type="dxa" w:w="140"/>
-              <w:bottom w:type="dxa" w:w="100"/>
-              <w:right w:type="dxa" w:w="140"/>
+              <w:top w:type="dxa" w:w="90"/>
+              <w:left w:type="dxa" w:w="130"/>
+              <w:bottom w:type="dxa" w:w="90"/>
+              <w:right w:type="dxa" w:w="130"/>
             </w:tcMar>
           </w:tcPr>
           <w:p>
@@ -4326,10 +4716,10 @@
             <w:tcW w:type="pct" w:w="24%"/>
             <w:shd w:fill="F8FAFC" w:val="clear"/>
             <w:tcMar>
-              <w:top w:type="dxa" w:w="100"/>
-              <w:left w:type="dxa" w:w="140"/>
-              <w:bottom w:type="dxa" w:w="100"/>
-              <w:right w:type="dxa" w:w="140"/>
+              <w:top w:type="dxa" w:w="90"/>
+              <w:left w:type="dxa" w:w="130"/>
+              <w:bottom w:type="dxa" w:w="90"/>
+              <w:right w:type="dxa" w:w="130"/>
             </w:tcMar>
           </w:tcPr>
           <w:p>
@@ -4351,10 +4741,10 @@
             <w:tcW w:type="pct" w:w="26%"/>
             <w:shd w:fill="F8FAFC" w:val="clear"/>
             <w:tcMar>
-              <w:top w:type="dxa" w:w="100"/>
-              <w:left w:type="dxa" w:w="140"/>
-              <w:bottom w:type="dxa" w:w="100"/>
-              <w:right w:type="dxa" w:w="140"/>
+              <w:top w:type="dxa" w:w="90"/>
+              <w:left w:type="dxa" w:w="130"/>
+              <w:bottom w:type="dxa" w:w="90"/>
+              <w:right w:type="dxa" w:w="130"/>
             </w:tcMar>
           </w:tcPr>
           <w:p>
@@ -4378,10 +4768,10 @@
             <w:tcW w:type="pct" w:w="50%"/>
             <w:shd w:fill="F8FAFC" w:val="clear"/>
             <w:tcMar>
-              <w:top w:type="dxa" w:w="100"/>
-              <w:left w:type="dxa" w:w="140"/>
-              <w:bottom w:type="dxa" w:w="100"/>
-              <w:right w:type="dxa" w:w="140"/>
+              <w:top w:type="dxa" w:w="90"/>
+              <w:left w:type="dxa" w:w="130"/>
+              <w:bottom w:type="dxa" w:w="90"/>
+              <w:right w:type="dxa" w:w="130"/>
             </w:tcMar>
           </w:tcPr>
           <w:p>
@@ -4403,10 +4793,10 @@
             <w:tcW w:type="pct" w:w="24%"/>
             <w:shd w:fill="F8FAFC" w:val="clear"/>
             <w:tcMar>
-              <w:top w:type="dxa" w:w="100"/>
-              <w:left w:type="dxa" w:w="140"/>
-              <w:bottom w:type="dxa" w:w="100"/>
-              <w:right w:type="dxa" w:w="140"/>
+              <w:top w:type="dxa" w:w="90"/>
+              <w:left w:type="dxa" w:w="130"/>
+              <w:bottom w:type="dxa" w:w="90"/>
+              <w:right w:type="dxa" w:w="130"/>
             </w:tcMar>
           </w:tcPr>
           <w:p>
@@ -4428,10 +4818,10 @@
             <w:tcW w:type="pct" w:w="26%"/>
             <w:shd w:fill="F8FAFC" w:val="clear"/>
             <w:tcMar>
-              <w:top w:type="dxa" w:w="100"/>
-              <w:left w:type="dxa" w:w="140"/>
-              <w:bottom w:type="dxa" w:w="100"/>
-              <w:right w:type="dxa" w:w="140"/>
+              <w:top w:type="dxa" w:w="90"/>
+              <w:left w:type="dxa" w:w="130"/>
+              <w:bottom w:type="dxa" w:w="90"/>
+              <w:right w:type="dxa" w:w="130"/>
             </w:tcMar>
           </w:tcPr>
           <w:p>
@@ -4455,10 +4845,10 @@
             <w:tcW w:type="pct" w:w="50%"/>
             <w:shd w:fill="F8FAFC" w:val="clear"/>
             <w:tcMar>
-              <w:top w:type="dxa" w:w="100"/>
-              <w:left w:type="dxa" w:w="140"/>
-              <w:bottom w:type="dxa" w:w="100"/>
-              <w:right w:type="dxa" w:w="140"/>
+              <w:top w:type="dxa" w:w="90"/>
+              <w:left w:type="dxa" w:w="130"/>
+              <w:bottom w:type="dxa" w:w="90"/>
+              <w:right w:type="dxa" w:w="130"/>
             </w:tcMar>
           </w:tcPr>
           <w:p>
@@ -4480,10 +4870,10 @@
             <w:tcW w:type="pct" w:w="24%"/>
             <w:shd w:fill="F8FAFC" w:val="clear"/>
             <w:tcMar>
-              <w:top w:type="dxa" w:w="100"/>
-              <w:left w:type="dxa" w:w="140"/>
-              <w:bottom w:type="dxa" w:w="100"/>
-              <w:right w:type="dxa" w:w="140"/>
+              <w:top w:type="dxa" w:w="90"/>
+              <w:left w:type="dxa" w:w="130"/>
+              <w:bottom w:type="dxa" w:w="90"/>
+              <w:right w:type="dxa" w:w="130"/>
             </w:tcMar>
           </w:tcPr>
           <w:p>
@@ -4505,10 +4895,10 @@
             <w:tcW w:type="pct" w:w="26%"/>
             <w:shd w:fill="F8FAFC" w:val="clear"/>
             <w:tcMar>
-              <w:top w:type="dxa" w:w="100"/>
-              <w:left w:type="dxa" w:w="140"/>
-              <w:bottom w:type="dxa" w:w="100"/>
-              <w:right w:type="dxa" w:w="140"/>
+              <w:top w:type="dxa" w:w="90"/>
+              <w:left w:type="dxa" w:w="130"/>
+              <w:bottom w:type="dxa" w:w="90"/>
+              <w:right w:type="dxa" w:w="130"/>
             </w:tcMar>
           </w:tcPr>
           <w:p>
@@ -4532,10 +4922,10 @@
             <w:tcW w:type="pct" w:w="50%"/>
             <w:shd w:fill="F8FAFC" w:val="clear"/>
             <w:tcMar>
-              <w:top w:type="dxa" w:w="100"/>
-              <w:left w:type="dxa" w:w="140"/>
-              <w:bottom w:type="dxa" w:w="100"/>
-              <w:right w:type="dxa" w:w="140"/>
+              <w:top w:type="dxa" w:w="90"/>
+              <w:left w:type="dxa" w:w="130"/>
+              <w:bottom w:type="dxa" w:w="90"/>
+              <w:right w:type="dxa" w:w="130"/>
             </w:tcMar>
           </w:tcPr>
           <w:p>
@@ -4557,10 +4947,10 @@
             <w:tcW w:type="pct" w:w="24%"/>
             <w:shd w:fill="F8FAFC" w:val="clear"/>
             <w:tcMar>
-              <w:top w:type="dxa" w:w="100"/>
-              <w:left w:type="dxa" w:w="140"/>
-              <w:bottom w:type="dxa" w:w="100"/>
-              <w:right w:type="dxa" w:w="140"/>
+              <w:top w:type="dxa" w:w="90"/>
+              <w:left w:type="dxa" w:w="130"/>
+              <w:bottom w:type="dxa" w:w="90"/>
+              <w:right w:type="dxa" w:w="130"/>
             </w:tcMar>
           </w:tcPr>
           <w:p>
@@ -4582,10 +4972,10 @@
             <w:tcW w:type="pct" w:w="26%"/>
             <w:shd w:fill="F8FAFC" w:val="clear"/>
             <w:tcMar>
-              <w:top w:type="dxa" w:w="100"/>
-              <w:left w:type="dxa" w:w="140"/>
-              <w:bottom w:type="dxa" w:w="100"/>
-              <w:right w:type="dxa" w:w="140"/>
+              <w:top w:type="dxa" w:w="90"/>
+              <w:left w:type="dxa" w:w="130"/>
+              <w:bottom w:type="dxa" w:w="90"/>
+              <w:right w:type="dxa" w:w="130"/>
             </w:tcMar>
           </w:tcPr>
           <w:p>
@@ -4609,10 +4999,10 @@
             <w:tcW w:type="pct" w:w="50%"/>
             <w:shd w:fill="F8FAFC" w:val="clear"/>
             <w:tcMar>
-              <w:top w:type="dxa" w:w="100"/>
-              <w:left w:type="dxa" w:w="140"/>
-              <w:bottom w:type="dxa" w:w="100"/>
-              <w:right w:type="dxa" w:w="140"/>
+              <w:top w:type="dxa" w:w="90"/>
+              <w:left w:type="dxa" w:w="130"/>
+              <w:bottom w:type="dxa" w:w="90"/>
+              <w:right w:type="dxa" w:w="130"/>
             </w:tcMar>
           </w:tcPr>
           <w:p>
@@ -4634,10 +5024,10 @@
             <w:tcW w:type="pct" w:w="24%"/>
             <w:shd w:fill="F8FAFC" w:val="clear"/>
             <w:tcMar>
-              <w:top w:type="dxa" w:w="100"/>
-              <w:left w:type="dxa" w:w="140"/>
-              <w:bottom w:type="dxa" w:w="100"/>
-              <w:right w:type="dxa" w:w="140"/>
+              <w:top w:type="dxa" w:w="90"/>
+              <w:left w:type="dxa" w:w="130"/>
+              <w:bottom w:type="dxa" w:w="90"/>
+              <w:right w:type="dxa" w:w="130"/>
             </w:tcMar>
           </w:tcPr>
           <w:p>
@@ -4659,10 +5049,10 @@
             <w:tcW w:type="pct" w:w="26%"/>
             <w:shd w:fill="F8FAFC" w:val="clear"/>
             <w:tcMar>
-              <w:top w:type="dxa" w:w="100"/>
-              <w:left w:type="dxa" w:w="140"/>
-              <w:bottom w:type="dxa" w:w="100"/>
-              <w:right w:type="dxa" w:w="140"/>
+              <w:top w:type="dxa" w:w="90"/>
+              <w:left w:type="dxa" w:w="130"/>
+              <w:bottom w:type="dxa" w:w="90"/>
+              <w:right w:type="dxa" w:w="130"/>
             </w:tcMar>
           </w:tcPr>
           <w:p>
@@ -4686,10 +5076,10 @@
             <w:tcW w:type="pct" w:w="50%"/>
             <w:shd w:fill="F8FAFC" w:val="clear"/>
             <w:tcMar>
-              <w:top w:type="dxa" w:w="100"/>
-              <w:left w:type="dxa" w:w="140"/>
-              <w:bottom w:type="dxa" w:w="100"/>
-              <w:right w:type="dxa" w:w="140"/>
+              <w:top w:type="dxa" w:w="90"/>
+              <w:left w:type="dxa" w:w="130"/>
+              <w:bottom w:type="dxa" w:w="90"/>
+              <w:right w:type="dxa" w:w="130"/>
             </w:tcMar>
           </w:tcPr>
           <w:p>
@@ -4711,10 +5101,10 @@
             <w:tcW w:type="pct" w:w="24%"/>
             <w:shd w:fill="F8FAFC" w:val="clear"/>
             <w:tcMar>
-              <w:top w:type="dxa" w:w="100"/>
-              <w:left w:type="dxa" w:w="140"/>
-              <w:bottom w:type="dxa" w:w="100"/>
-              <w:right w:type="dxa" w:w="140"/>
+              <w:top w:type="dxa" w:w="90"/>
+              <w:left w:type="dxa" w:w="130"/>
+              <w:bottom w:type="dxa" w:w="90"/>
+              <w:right w:type="dxa" w:w="130"/>
             </w:tcMar>
           </w:tcPr>
           <w:p>
@@ -4736,10 +5126,10 @@
             <w:tcW w:type="pct" w:w="26%"/>
             <w:shd w:fill="F8FAFC" w:val="clear"/>
             <w:tcMar>
-              <w:top w:type="dxa" w:w="100"/>
-              <w:left w:type="dxa" w:w="140"/>
-              <w:bottom w:type="dxa" w:w="100"/>
-              <w:right w:type="dxa" w:w="140"/>
+              <w:top w:type="dxa" w:w="90"/>
+              <w:left w:type="dxa" w:w="130"/>
+              <w:bottom w:type="dxa" w:w="90"/>
+              <w:right w:type="dxa" w:w="130"/>
             </w:tcMar>
           </w:tcPr>
           <w:p>
@@ -4761,7 +5151,7 @@
     <w:p>
       <w:pPr>
         <w:pStyle w:val="Heading1"/>
-        <w:spacing w:after="100" w:before="240"/>
+        <w:spacing w:after="80" w:before="200"/>
       </w:pPr>
       <w:r>
         <w:rPr>
@@ -4771,53 +5161,69 @@
           <w:sz w:val="24"/>
           <w:szCs w:val="24"/>
         </w:rPr>
-        <w:t xml:space="preserve">10. Discussion, Limitations &amp; Future Work</w:t>
+        <w:t xml:space="preserve">11. Discussion, Limitations &amp; Future Work</w:t>
       </w:r>
     </w:p>
     <w:p>
       <w:pPr>
-        <w:spacing w:after="80" w:before="80"/>
+        <w:spacing w:after="70" w:before="70"/>
       </w:pPr>
       <w:r>
         <w:rPr>
           <w:b/>
           <w:bCs/>
-          <w:color w:val="2563EB"/>
-          <w:sz w:val="21"/>
-          <w:szCs w:val="21"/>
-        </w:rPr>
-        <w:t xml:space="preserve">10.1 Technical Limitations &amp; Edge Cases
-</w:t>
-      </w:r>
-      <w:r>
-        <w:rPr>
           <w:sz w:val="20"/>
           <w:szCs w:val="20"/>
         </w:rPr>
-        <w:t xml:space="preserve">• Low-Light Environments: Webcam sensors in dark lecture halls introduce grain that reduces MediaPipe joint confidence. The system handles this with an on-screen lighting warning banner.
-• Extreme Camera Angles: Presenters standing more than 60 degrees off-axis experience foreshortening. The ideal capture zone is within ±45 degrees.
+        <w:t xml:space="preserve">• Low-Light Environments: </w:t>
+      </w:r>
+      <w:r>
+        <w:rPr>
+          <w:sz w:val="20"/>
+          <w:szCs w:val="20"/>
+        </w:rPr>
+        <w:t xml:space="preserve">Webcam sensors in dark lecture halls introduce grain that reduces MediaPipe joint confidence. The system handles this with an on-screen lighting warning banner.
 </w:t>
       </w:r>
       <w:r>
         <w:rPr>
           <w:b/>
           <w:bCs/>
-          <w:color w:val="2563EB"/>
-          <w:sz w:val="21"/>
-          <w:szCs w:val="21"/>
-        </w:rPr>
-        <w:t xml:space="preserve">10.2 Future Research Trajectories
-</w:t>
-      </w:r>
-      <w:r>
-        <w:rPr>
           <w:sz w:val="20"/>
           <w:szCs w:val="20"/>
         </w:rPr>
-        <w:t xml:space="preserve">• Multi-Presenter Handover: Tracking unique hand IDs to allow co-presenters to pass presentation control seamlessly.
-• Multimodal Voice + Gesture Fusion: Combining whisper speech keywords with micro-gestures for dual-confirmation presentation control.
+        <w:t xml:space="preserve">• Extreme Camera Angles: </w:t>
+      </w:r>
+      <w:r>
+        <w:rPr>
+          <w:sz w:val="20"/>
+          <w:szCs w:val="20"/>
+        </w:rPr>
+        <w:t xml:space="preserve">Presenters standing more than 60 degrees off-axis experience foreshortening. The ideal capture zone is within ±45 degrees.
 </w:t>
       </w:r>
+      <w:r>
+        <w:rPr>
+          <w:b/>
+          <w:bCs/>
+          <w:sz w:val="20"/>
+          <w:szCs w:val="20"/>
+        </w:rPr>
+        <w:t xml:space="preserve">• Future Trajectories: </w:t>
+      </w:r>
+      <w:r>
+        <w:rPr>
+          <w:sz w:val="20"/>
+          <w:szCs w:val="20"/>
+        </w:rPr>
+        <w:t xml:space="preserve">Multi-presenter handover recognition, subtle eye-gaze tracking, and multimodal speech-gesture fusion.</w:t>
+      </w:r>
+    </w:p>
+    <w:p>
+      <w:pPr>
+        <w:pStyle w:val="Heading1"/>
+        <w:spacing w:after="80" w:before="200"/>
+      </w:pPr>
       <w:r>
         <w:rPr>
           <w:b/>
@@ -4826,121 +5232,50 @@
           <w:sz w:val="24"/>
           <w:szCs w:val="24"/>
         </w:rPr>
-        <w:t xml:space="preserve">11. Conclusion
+        <w:t xml:space="preserve">12. Conclusion &amp; References</w:t>
+      </w:r>
+    </w:p>
+    <w:p>
+      <w:pPr>
+        <w:spacing w:after="50" w:before="50"/>
+      </w:pPr>
+      <w:r>
+        <w:rPr>
+          <w:sz w:val="19"/>
+          <w:szCs w:val="19"/>
+        </w:rPr>
+        <w:t xml:space="preserve">AirSlide demonstrates that camera-based Natural User Interfaces can achieve industrial-grade reliability and delightful usability by adhering strictly to fundamental HCI and cognitive human factors principles. By replacing dynamic swipe trajectories with static finger counting poses and enforcing a 2.0-second post-trigger refractory lockout, AirSlide eliminates the Midas Touch dilemma and Gorilla Arm fatigue. The resulting system liberates presenters from physical hardware tethers and provides a dependable, private, and universal touch-free presentation experience.
 </w:t>
       </w:r>
       <w:r>
         <w:rPr>
-          <w:sz w:val="20"/>
-          <w:szCs w:val="20"/>
-        </w:rPr>
-        <w:t xml:space="preserve">AirSlide demonstrates that camera-based Natural User Interfaces can achieve industrial-grade reliability and delightful usability by adhering strictly to fundamental HCI and cognitive human factors principles. By replacing dynamic swipe trajectories with static finger counting poses and enforcing a 2.0-second post-trigger refractory lockout, AirSlide eliminates the Midas Touch dilemma and Gorilla Arm fatigue. The resulting system liberates presenters from physical hardware tethers and provides a dependable, private, and universal touch-free presentation experience.</w:t>
+          <w:b/>
+          <w:bCs/>
+          <w:sz w:val="19"/>
+          <w:szCs w:val="19"/>
+        </w:rPr>
+        <w:t xml:space="preserve">References:
+</w:t>
+      </w:r>
+      <w:r>
+        <w:rPr>
+          <w:sz w:val="17"/>
+          <w:szCs w:val="17"/>
+        </w:rPr>
+        <w:t xml:space="preserve">1. Fitts, P. M. (1954). J. Exp. Psychol., 47(6), 381-391.
+2. Hick, W. E. (1952). Q. J. Exp. Psychol., 4(1), 11-26.
+3. Norman, D. A. (2013). The Design of Everyday Things. Basic Books.
+4. Nielsen, J. (1994). Usability Engineering. Morgan Kaufmann.
+5. Shneiderman, B., et al. (2016). Designing the User Interface (6th ed.). Pearson.
+6. Sweller, J. (1988). Cognitive Science, 12(2), 257-285.
+7. Brooke, J. (1996). SUS Scale. Usability Evaluation in Industry.
+8. Lugaresi, C., et al. (2019). MediaPipe. arXiv:1906.08172.</w:t>
       </w:r>
     </w:p>
     <w:p>
       <w:pPr>
         <w:pStyle w:val="Heading1"/>
-        <w:spacing w:after="100" w:before="240"/>
-      </w:pPr>
-      <w:r>
-        <w:rPr>
-          <w:b/>
-          <w:bCs/>
-          <w:color w:val="1E3A8A"/>
-          <w:sz w:val="24"/>
-          <w:szCs w:val="24"/>
-        </w:rPr>
-        <w:t xml:space="preserve">12. Academic References</w:t>
-      </w:r>
-    </w:p>
-    <w:p>
-      <w:pPr>
-        <w:spacing w:after="60" w:before="60"/>
-      </w:pPr>
-      <w:r>
-        <w:rPr>
-          <w:sz w:val="18"/>
-          <w:szCs w:val="18"/>
-        </w:rPr>
-        <w:t xml:space="preserve">1. Fitts, P. M. (1954). The information capacity of the human motor system in controlling the amplitude of movement. Journal of Experimental Psychology, 47(6), 381–391.
-</w:t>
-      </w:r>
-      <w:r>
-        <w:rPr>
-          <w:sz w:val="18"/>
-          <w:szCs w:val="18"/>
-        </w:rPr>
-        <w:t xml:space="preserve">2. Hick, W. E. (1952). On the rate of gain of information. Quarterly Journal of Experimental Psychology, 4(1), 11–26.
-</w:t>
-      </w:r>
-      <w:r>
-        <w:rPr>
-          <w:sz w:val="18"/>
-          <w:szCs w:val="18"/>
-        </w:rPr>
-        <w:t xml:space="preserve">3. Norman, D. A. (2013). The Design of Everyday Things: Revised and Expanded Edition. Basic Books, New York.
-</w:t>
-      </w:r>
-      <w:r>
-        <w:rPr>
-          <w:sz w:val="18"/>
-          <w:szCs w:val="18"/>
-        </w:rPr>
-        <w:t xml:space="preserve">4. Nielsen, J. (1994). Usability Engineering. Morgan Kaufmann Publishers, San Francisco.
-</w:t>
-      </w:r>
-      <w:r>
-        <w:rPr>
-          <w:sz w:val="18"/>
-          <w:szCs w:val="18"/>
-        </w:rPr>
-        <w:t xml:space="preserve">5. Shneiderman, B., et al. (2016). Designing the User Interface: Strategies for Effective HCI (6th ed.). Pearson.
-</w:t>
-      </w:r>
-      <w:r>
-        <w:rPr>
-          <w:sz w:val="18"/>
-          <w:szCs w:val="18"/>
-        </w:rPr>
-        <w:t xml:space="preserve">6. Sweller, J. (1988). Cognitive load during problem solving: Effects on learning. Cognitive Science, 12(2), 257–285.
-</w:t>
-      </w:r>
-      <w:r>
-        <w:rPr>
-          <w:sz w:val="18"/>
-          <w:szCs w:val="18"/>
-        </w:rPr>
-        <w:t xml:space="preserve">7. Brooke, J. (1996). SUS: A 'quick and dirty' usability scale. In Usability Evaluation in Industry (pp. 189–194). Taylor &amp; Francis.
-</w:t>
-      </w:r>
-      <w:r>
-        <w:rPr>
-          <w:sz w:val="18"/>
-          <w:szCs w:val="18"/>
-        </w:rPr>
-        <w:t xml:space="preserve">8. Lugaresi, C., et al. (2019). MediaPipe: A Framework for Building Perception Pipelines. arXiv:1906.08172.
-</w:t>
-      </w:r>
-      <w:r>
-        <w:rPr>
-          <w:sz w:val="18"/>
-          <w:szCs w:val="18"/>
-        </w:rPr>
-        <w:t xml:space="preserve">9. Wigdor, D., &amp; Wixon, D. (2011). Brave NUI World: Designing Natural User Interfaces. Morgan Kaufmann.
-</w:t>
-      </w:r>
-      <w:r>
-        <w:rPr>
-          <w:sz w:val="18"/>
-          <w:szCs w:val="18"/>
-        </w:rPr>
-        <w:t xml:space="preserve">10. Hyman, R. (1953). Stimulus information as a determinant of reaction time. Journal of Experimental Psychology, 45(3), 188–196.</w:t>
-      </w:r>
-    </w:p>
-    <w:p>
-      <w:pPr>
-        <w:pStyle w:val="Heading1"/>
-        <w:spacing w:after="100" w:before="240"/>
+        <w:spacing w:after="80" w:before="200"/>
       </w:pPr>
       <w:r>
         <w:rPr>
@@ -4976,10 +5311,10 @@
             <w:tcW w:type="pct" w:w="28%"/>
             <w:shd w:fill="1E3A8A" w:val="clear"/>
             <w:tcMar>
-              <w:top w:type="dxa" w:w="100"/>
-              <w:left w:type="dxa" w:w="140"/>
-              <w:bottom w:type="dxa" w:w="100"/>
-              <w:right w:type="dxa" w:w="140"/>
+              <w:top w:type="dxa" w:w="90"/>
+              <w:left w:type="dxa" w:w="130"/>
+              <w:bottom w:type="dxa" w:w="90"/>
+              <w:right w:type="dxa" w:w="130"/>
             </w:tcMar>
           </w:tcPr>
           <w:p>
@@ -5001,10 +5336,10 @@
             <w:tcW w:type="pct" w:w="36%"/>
             <w:shd w:fill="1E3A8A" w:val="clear"/>
             <w:tcMar>
-              <w:top w:type="dxa" w:w="100"/>
-              <w:left w:type="dxa" w:w="140"/>
-              <w:bottom w:type="dxa" w:w="100"/>
-              <w:right w:type="dxa" w:w="140"/>
+              <w:top w:type="dxa" w:w="90"/>
+              <w:left w:type="dxa" w:w="130"/>
+              <w:bottom w:type="dxa" w:w="90"/>
+              <w:right w:type="dxa" w:w="130"/>
             </w:tcMar>
           </w:tcPr>
           <w:p>
@@ -5026,10 +5361,10 @@
             <w:tcW w:type="pct" w:w="36%"/>
             <w:shd w:fill="1E3A8A" w:val="clear"/>
             <w:tcMar>
-              <w:top w:type="dxa" w:w="100"/>
-              <w:left w:type="dxa" w:w="140"/>
-              <w:bottom w:type="dxa" w:w="100"/>
-              <w:right w:type="dxa" w:w="140"/>
+              <w:top w:type="dxa" w:w="90"/>
+              <w:left w:type="dxa" w:w="130"/>
+              <w:bottom w:type="dxa" w:w="90"/>
+              <w:right w:type="dxa" w:w="130"/>
             </w:tcMar>
           </w:tcPr>
           <w:p>
@@ -5042,7 +5377,7 @@
                 <w:sz w:val="19"/>
                 <w:szCs w:val="19"/>
               </w:rPr>
-              <w:t xml:space="preserve">Key Contributions</w:t>
+              <w:t xml:space="preserve">Key Deliverables</w:t>
             </w:r>
           </w:p>
         </w:tc>
@@ -5053,10 +5388,10 @@
             <w:tcW w:type="pct" w:w="28%"/>
             <w:shd w:fill="F8FAFC" w:val="clear"/>
             <w:tcMar>
-              <w:top w:type="dxa" w:w="100"/>
-              <w:left w:type="dxa" w:w="140"/>
-              <w:bottom w:type="dxa" w:w="100"/>
-              <w:right w:type="dxa" w:w="140"/>
+              <w:top w:type="dxa" w:w="90"/>
+              <w:left w:type="dxa" w:w="130"/>
+              <w:bottom w:type="dxa" w:w="90"/>
+              <w:right w:type="dxa" w:w="130"/>
             </w:tcMar>
           </w:tcPr>
           <w:p>
@@ -5078,10 +5413,10 @@
             <w:tcW w:type="pct" w:w="36%"/>
             <w:shd w:fill="F8FAFC" w:val="clear"/>
             <w:tcMar>
-              <w:top w:type="dxa" w:w="100"/>
-              <w:left w:type="dxa" w:w="140"/>
-              <w:bottom w:type="dxa" w:w="100"/>
-              <w:right w:type="dxa" w:w="140"/>
+              <w:top w:type="dxa" w:w="90"/>
+              <w:left w:type="dxa" w:w="130"/>
+              <w:bottom w:type="dxa" w:w="90"/>
+              <w:right w:type="dxa" w:w="130"/>
             </w:tcMar>
           </w:tcPr>
           <w:p>
@@ -5103,10 +5438,10 @@
             <w:tcW w:type="pct" w:w="36%"/>
             <w:shd w:fill="F8FAFC" w:val="clear"/>
             <w:tcMar>
-              <w:top w:type="dxa" w:w="100"/>
-              <w:left w:type="dxa" w:w="140"/>
-              <w:bottom w:type="dxa" w:w="100"/>
-              <w:right w:type="dxa" w:w="140"/>
+              <w:top w:type="dxa" w:w="90"/>
+              <w:left w:type="dxa" w:w="130"/>
+              <w:bottom w:type="dxa" w:w="90"/>
+              <w:right w:type="dxa" w:w="130"/>
             </w:tcMar>
           </w:tcPr>
           <w:p>
@@ -5130,10 +5465,10 @@
             <w:tcW w:type="pct" w:w="28%"/>
             <w:shd w:fill="F8FAFC" w:val="clear"/>
             <w:tcMar>
-              <w:top w:type="dxa" w:w="100"/>
-              <w:left w:type="dxa" w:w="140"/>
-              <w:bottom w:type="dxa" w:w="100"/>
-              <w:right w:type="dxa" w:w="140"/>
+              <w:top w:type="dxa" w:w="90"/>
+              <w:left w:type="dxa" w:w="130"/>
+              <w:bottom w:type="dxa" w:w="90"/>
+              <w:right w:type="dxa" w:w="130"/>
             </w:tcMar>
           </w:tcPr>
           <w:p>
@@ -5155,10 +5490,10 @@
             <w:tcW w:type="pct" w:w="36%"/>
             <w:shd w:fill="F8FAFC" w:val="clear"/>
             <w:tcMar>
-              <w:top w:type="dxa" w:w="100"/>
-              <w:left w:type="dxa" w:w="140"/>
-              <w:bottom w:type="dxa" w:w="100"/>
-              <w:right w:type="dxa" w:w="140"/>
+              <w:top w:type="dxa" w:w="90"/>
+              <w:left w:type="dxa" w:w="130"/>
+              <w:bottom w:type="dxa" w:w="90"/>
+              <w:right w:type="dxa" w:w="130"/>
             </w:tcMar>
           </w:tcPr>
           <w:p>
@@ -5180,10 +5515,10 @@
             <w:tcW w:type="pct" w:w="36%"/>
             <w:shd w:fill="F8FAFC" w:val="clear"/>
             <w:tcMar>
-              <w:top w:type="dxa" w:w="100"/>
-              <w:left w:type="dxa" w:w="140"/>
-              <w:bottom w:type="dxa" w:w="100"/>
-              <w:right w:type="dxa" w:w="140"/>
+              <w:top w:type="dxa" w:w="90"/>
+              <w:left w:type="dxa" w:w="130"/>
+              <w:bottom w:type="dxa" w:w="90"/>
+              <w:right w:type="dxa" w:w="130"/>
             </w:tcMar>
           </w:tcPr>
           <w:p>
@@ -5207,10 +5542,10 @@
             <w:tcW w:type="pct" w:w="28%"/>
             <w:shd w:fill="F8FAFC" w:val="clear"/>
             <w:tcMar>
-              <w:top w:type="dxa" w:w="100"/>
-              <w:left w:type="dxa" w:w="140"/>
-              <w:bottom w:type="dxa" w:w="100"/>
-              <w:right w:type="dxa" w:w="140"/>
+              <w:top w:type="dxa" w:w="90"/>
+              <w:left w:type="dxa" w:w="130"/>
+              <w:bottom w:type="dxa" w:w="90"/>
+              <w:right w:type="dxa" w:w="130"/>
             </w:tcMar>
           </w:tcPr>
           <w:p>
@@ -5232,10 +5567,10 @@
             <w:tcW w:type="pct" w:w="36%"/>
             <w:shd w:fill="F8FAFC" w:val="clear"/>
             <w:tcMar>
-              <w:top w:type="dxa" w:w="100"/>
-              <w:left w:type="dxa" w:w="140"/>
-              <w:bottom w:type="dxa" w:w="100"/>
-              <w:right w:type="dxa" w:w="140"/>
+              <w:top w:type="dxa" w:w="90"/>
+              <w:left w:type="dxa" w:w="130"/>
+              <w:bottom w:type="dxa" w:w="90"/>
+              <w:right w:type="dxa" w:w="130"/>
             </w:tcMar>
           </w:tcPr>
           <w:p>
@@ -5257,10 +5592,10 @@
             <w:tcW w:type="pct" w:w="36%"/>
             <w:shd w:fill="F8FAFC" w:val="clear"/>
             <w:tcMar>
-              <w:top w:type="dxa" w:w="100"/>
-              <w:left w:type="dxa" w:w="140"/>
-              <w:bottom w:type="dxa" w:w="100"/>
-              <w:right w:type="dxa" w:w="140"/>
+              <w:top w:type="dxa" w:w="90"/>
+              <w:left w:type="dxa" w:w="130"/>
+              <w:bottom w:type="dxa" w:w="90"/>
+              <w:right w:type="dxa" w:w="130"/>
             </w:tcMar>
           </w:tcPr>
           <w:p>
@@ -5284,10 +5619,10 @@
             <w:tcW w:type="pct" w:w="28%"/>
             <w:shd w:fill="F8FAFC" w:val="clear"/>
             <w:tcMar>
-              <w:top w:type="dxa" w:w="100"/>
-              <w:left w:type="dxa" w:w="140"/>
-              <w:bottom w:type="dxa" w:w="100"/>
-              <w:right w:type="dxa" w:w="140"/>
+              <w:top w:type="dxa" w:w="90"/>
+              <w:left w:type="dxa" w:w="130"/>
+              <w:bottom w:type="dxa" w:w="90"/>
+              <w:right w:type="dxa" w:w="130"/>
             </w:tcMar>
           </w:tcPr>
           <w:p>
@@ -5309,10 +5644,10 @@
             <w:tcW w:type="pct" w:w="36%"/>
             <w:shd w:fill="F8FAFC" w:val="clear"/>
             <w:tcMar>
-              <w:top w:type="dxa" w:w="100"/>
-              <w:left w:type="dxa" w:w="140"/>
-              <w:bottom w:type="dxa" w:w="100"/>
-              <w:right w:type="dxa" w:w="140"/>
+              <w:top w:type="dxa" w:w="90"/>
+              <w:left w:type="dxa" w:w="130"/>
+              <w:bottom w:type="dxa" w:w="90"/>
+              <w:right w:type="dxa" w:w="130"/>
             </w:tcMar>
           </w:tcPr>
           <w:p>
@@ -5334,10 +5669,10 @@
             <w:tcW w:type="pct" w:w="36%"/>
             <w:shd w:fill="F8FAFC" w:val="clear"/>
             <w:tcMar>
-              <w:top w:type="dxa" w:w="100"/>
-              <w:left w:type="dxa" w:w="140"/>
-              <w:bottom w:type="dxa" w:w="100"/>
-              <w:right w:type="dxa" w:w="140"/>
+              <w:top w:type="dxa" w:w="90"/>
+              <w:left w:type="dxa" w:w="130"/>
+              <w:bottom w:type="dxa" w:w="90"/>
+              <w:right w:type="dxa" w:w="130"/>
             </w:tcMar>
           </w:tcPr>
           <w:p>
@@ -5507,7 +5842,7 @@
         <w:sz w:val="16"/>
         <w:szCs w:val="16"/>
       </w:rPr>
-      <w:t xml:space="preserve">AirSlide: HCI Project Report | HiLCoE School of Computer Science</w:t>
+      <w:t xml:space="preserve">AirSlide: Touch-Free Presentation Control | HCI Project Report</w:t>
     </w:r>
   </w:p>
 </w:hdr>
@@ -5621,7 +5956,7 @@
     </w:rPrDefault>
     <w:pPrDefault>
       <w:pPr>
-        <w:spacing w:after="80" w:before="80" w:line="260"/>
+        <w:spacing w:after="70" w:before="70" w:line="260"/>
       </w:pPr>
     </w:pPrDefault>
   </w:docDefaults>

</xml_diff>